<commit_message>
STMS: conventional vs ours demo, ambulance, team split
</commit_message>
<xml_diff>
--- a/deliverables/STMS_Case_Study_Report.docx
+++ b/deliverables/STMS_Case_Study_Report.docx
@@ -29,7 +29,7 @@
           <w:sz w:val="26"/>
           <w:szCs w:val="26"/>
         </w:rPr>
-        <w:t xml:space="preserve">A Multi-Agent AI System with Max-Pressure Signal Control, A* Routing, Emergency Preemption, Negotiated Bus Priority and Hill-Climbing Policy Tuning</w:t>
+        <w:t xml:space="preserve">A Multi-Agent AI System with Max-Pressure Signal Control, A* Routing, Ambulance Preemption, Accident Re-routing and Hill-Climbing Policy Tuning</w:t>
       </w:r>
     </w:p>
     <w:p>
@@ -578,7 +578,7 @@
                 <w:sz w:val="19"/>
                 <w:szCs w:val="19"/>
               </w:rPr>
-              <w:t xml:space="preserve">Priority Vehicles</w:t>
+              <w:t xml:space="preserve">Ambulance Agent</w:t>
             </w:r>
           </w:p>
         </w:tc>
@@ -725,7 +725,7 @@
         <w:t xml:space="preserve">multi-agent system</w:t>
       </w:r>
       <w:r>
-        <w:t xml:space="preserve"> of five cooperating agent types. </w:t>
+        <w:t xml:space="preserve"> of four cooperating agent types. </w:t>
       </w:r>
       <w:r>
         <w:rPr>
@@ -775,17 +775,7 @@
         <w:t xml:space="preserve">Ambulance agents</w:t>
       </w:r>
       <w:r>
-        <w:t xml:space="preserve"> preempt signals ahead of them. </w:t>
-      </w:r>
-      <w:r>
-        <w:rPr>
-          <w:b/>
-          <w:bCs/>
-        </w:rPr>
-        <w:t xml:space="preserve">Bus agents</w:t>
-      </w:r>
-      <w:r>
-        <w:t xml:space="preserve"> negotiate priority, and intersections may refuse. A </w:t>
+        <w:t xml:space="preserve"> preempt signals ahead of them. A </w:t>
       </w:r>
       <w:r>
         <w:rPr>
@@ -1805,7 +1795,7 @@
                 <w:sz w:val="17"/>
                 <w:szCs w:val="17"/>
               </w:rPr>
-              <w:t xml:space="preserve">Priority Vehicles</w:t>
+              <w:t xml:space="preserve">Ambulance Agent</w:t>
             </w:r>
           </w:p>
         </w:tc>
@@ -1837,7 +1827,7 @@
                 <w:sz w:val="17"/>
                 <w:szCs w:val="17"/>
               </w:rPr>
-              <w:t xml:space="preserve">emergency_agent.py, bus_agent.py</w:t>
+              <w:t xml:space="preserve">emergency_agent.py</w:t>
             </w:r>
           </w:p>
         </w:tc>
@@ -2403,7 +2393,7 @@
                 <w:sz w:val="16"/>
                 <w:szCs w:val="16"/>
               </w:rPr>
-              <w:t xml:space="preserve">Signal phase: NS green / EW green / yellow; messages AGREE, ACCEPT/REJECT_PROPOSAL, INFORM</w:t>
+              <w:t xml:space="preserve">Signal phase: NS green / EW green / yellow; messages AGREE, INFORM</w:t>
             </w:r>
           </w:p>
         </w:tc>
@@ -2434,7 +2424,7 @@
                 <w:sz w:val="16"/>
                 <w:szCs w:val="16"/>
               </w:rPr>
-              <w:t xml:space="preserve">Queue detectors on all 8 roads (loop counts); message inbox (preemption, bus proposals, platoons, parameter updates)</w:t>
+              <w:t xml:space="preserve">Queue detectors on all 8 roads (loop counts); message inbox (preemption, platoons, parameter updates)</w:t>
             </w:r>
           </w:p>
         </w:tc>
@@ -2824,7 +2814,7 @@
                 <w:sz w:val="16"/>
                 <w:szCs w:val="16"/>
               </w:rPr>
-              <w:t xml:space="preserve">Bus</w:t>
+              <w:t xml:space="preserve">Coordinator</w:t>
             </w:r>
           </w:p>
           <w:p>
@@ -2838,7 +2828,7 @@
                 <w:sz w:val="16"/>
                 <w:szCs w:val="16"/>
               </w:rPr>
-              <w:t xml:space="preserve">(M4)</w:t>
+              <w:t xml:space="preserve">(M5)</w:t>
             </w:r>
           </w:p>
         </w:tc>
@@ -2870,7 +2860,7 @@
                 <w:sz w:val="16"/>
                 <w:szCs w:val="16"/>
               </w:rPr>
-              <w:t xml:space="preserve">Min. passenger delay (40 passengers) without excessive harm to cross traffic</w:t>
+              <w:t xml:space="preserve">Network-wide average delay; incident awareness latency; delay on unseen traffic after tuning</w:t>
             </w:r>
           </w:p>
         </w:tc>
@@ -2902,7 +2892,7 @@
                 <w:sz w:val="16"/>
                 <w:szCs w:val="16"/>
               </w:rPr>
-              <w:t xml:space="preserve">Mixed traffic, junctions that may refuse</w:t>
+              <w:t xml:space="preserve">Whole network (aggregate densities), incident reports</w:t>
             </w:r>
           </w:p>
         </w:tc>
@@ -2934,7 +2924,7 @@
                 <w:sz w:val="16"/>
                 <w:szCs w:val="16"/>
               </w:rPr>
-              <w:t xml:space="preserve">Drive at 40 km/h; PROPOSE, CANCEL</w:t>
+              <w:t xml:space="preserve">BROADCAST INCIDENT_ALERT, INFORM CONGESTION_WARNING, INFORM PARAMETER_UPDATE</w:t>
             </w:r>
           </w:p>
         </w:tc>
@@ -2948,180 +2938,6 @@
               <w:right w:val="single" w:color="C9C7C1" w:sz="4"/>
             </w:tcBorders>
             <w:shd w:fill="F7F7F5" w:color="auto" w:val="clear"/>
-            <w:tcMar>
-              <w:top w:type="dxa" w:w="60"/>
-              <w:left w:type="dxa" w:w="100"/>
-              <w:bottom w:type="dxa" w:w="60"/>
-              <w:right w:type="dxa" w:w="100"/>
-            </w:tcMar>
-          </w:tcPr>
-          <w:p>
-            <w:pPr>
-              <w:spacing w:after="0"/>
-              <w:jc w:val="left"/>
-            </w:pPr>
-            <w:r>
-              <w:rPr>
-                <w:color w:val="000000"/>
-                <w:sz w:val="16"/>
-                <w:szCs w:val="16"/>
-              </w:rPr>
-              <w:t xml:space="preserve">Next junction ETA; ACCEPT/REJECT_PROPOSAL replies</w:t>
-            </w:r>
-          </w:p>
-        </w:tc>
-      </w:tr>
-      <w:tr>
-        <w:trPr>
-          <w:tblHeader w:val="false"/>
-        </w:trPr>
-        <w:tc>
-          <w:tcPr>
-            <w:tcW w:type="dxa" w:w="1150"/>
-            <w:tcBorders>
-              <w:top w:val="single" w:color="C9C7C1" w:sz="4"/>
-              <w:left w:val="single" w:color="C9C7C1" w:sz="4"/>
-              <w:bottom w:val="single" w:color="C9C7C1" w:sz="4"/>
-              <w:right w:val="single" w:color="C9C7C1" w:sz="4"/>
-            </w:tcBorders>
-            <w:tcMar>
-              <w:top w:type="dxa" w:w="60"/>
-              <w:left w:type="dxa" w:w="100"/>
-              <w:bottom w:type="dxa" w:w="60"/>
-              <w:right w:type="dxa" w:w="100"/>
-            </w:tcMar>
-          </w:tcPr>
-          <w:p>
-            <w:pPr>
-              <w:spacing w:after="0"/>
-              <w:jc w:val="left"/>
-            </w:pPr>
-            <w:r>
-              <w:rPr>
-                <w:color w:val="000000"/>
-                <w:sz w:val="16"/>
-                <w:szCs w:val="16"/>
-              </w:rPr>
-              <w:t xml:space="preserve">Coordinator</w:t>
-            </w:r>
-          </w:p>
-          <w:p>
-            <w:pPr>
-              <w:spacing w:after="0"/>
-              <w:jc w:val="left"/>
-            </w:pPr>
-            <w:r>
-              <w:rPr>
-                <w:color w:val="000000"/>
-                <w:sz w:val="16"/>
-                <w:szCs w:val="16"/>
-              </w:rPr>
-              <w:t xml:space="preserve">(M5)</w:t>
-            </w:r>
-          </w:p>
-        </w:tc>
-        <w:tc>
-          <w:tcPr>
-            <w:tcW w:type="dxa" w:w="2100"/>
-            <w:tcBorders>
-              <w:top w:val="single" w:color="C9C7C1" w:sz="4"/>
-              <w:left w:val="single" w:color="C9C7C1" w:sz="4"/>
-              <w:bottom w:val="single" w:color="C9C7C1" w:sz="4"/>
-              <w:right w:val="single" w:color="C9C7C1" w:sz="4"/>
-            </w:tcBorders>
-            <w:tcMar>
-              <w:top w:type="dxa" w:w="60"/>
-              <w:left w:type="dxa" w:w="100"/>
-              <w:bottom w:type="dxa" w:w="60"/>
-              <w:right w:type="dxa" w:w="100"/>
-            </w:tcMar>
-          </w:tcPr>
-          <w:p>
-            <w:pPr>
-              <w:spacing w:after="0"/>
-              <w:jc w:val="left"/>
-            </w:pPr>
-            <w:r>
-              <w:rPr>
-                <w:color w:val="000000"/>
-                <w:sz w:val="16"/>
-                <w:szCs w:val="16"/>
-              </w:rPr>
-              <w:t xml:space="preserve">Network-wide average delay; incident awareness latency; delay on unseen traffic after tuning</w:t>
-            </w:r>
-          </w:p>
-        </w:tc>
-        <w:tc>
-          <w:tcPr>
-            <w:tcW w:type="dxa" w:w="1800"/>
-            <w:tcBorders>
-              <w:top w:val="single" w:color="C9C7C1" w:sz="4"/>
-              <w:left w:val="single" w:color="C9C7C1" w:sz="4"/>
-              <w:bottom w:val="single" w:color="C9C7C1" w:sz="4"/>
-              <w:right w:val="single" w:color="C9C7C1" w:sz="4"/>
-            </w:tcBorders>
-            <w:tcMar>
-              <w:top w:type="dxa" w:w="60"/>
-              <w:left w:type="dxa" w:w="100"/>
-              <w:bottom w:type="dxa" w:w="60"/>
-              <w:right w:type="dxa" w:w="100"/>
-            </w:tcMar>
-          </w:tcPr>
-          <w:p>
-            <w:pPr>
-              <w:spacing w:after="0"/>
-              <w:jc w:val="left"/>
-            </w:pPr>
-            <w:r>
-              <w:rPr>
-                <w:color w:val="000000"/>
-                <w:sz w:val="16"/>
-                <w:szCs w:val="16"/>
-              </w:rPr>
-              <w:t xml:space="preserve">Whole network (aggregate densities), incident reports</w:t>
-            </w:r>
-          </w:p>
-        </w:tc>
-        <w:tc>
-          <w:tcPr>
-            <w:tcW w:type="dxa" w:w="1900"/>
-            <w:tcBorders>
-              <w:top w:val="single" w:color="C9C7C1" w:sz="4"/>
-              <w:left w:val="single" w:color="C9C7C1" w:sz="4"/>
-              <w:bottom w:val="single" w:color="C9C7C1" w:sz="4"/>
-              <w:right w:val="single" w:color="C9C7C1" w:sz="4"/>
-            </w:tcBorders>
-            <w:tcMar>
-              <w:top w:type="dxa" w:w="60"/>
-              <w:left w:type="dxa" w:w="100"/>
-              <w:bottom w:type="dxa" w:w="60"/>
-              <w:right w:type="dxa" w:w="100"/>
-            </w:tcMar>
-          </w:tcPr>
-          <w:p>
-            <w:pPr>
-              <w:spacing w:after="0"/>
-              <w:jc w:val="left"/>
-            </w:pPr>
-            <w:r>
-              <w:rPr>
-                <w:color w:val="000000"/>
-                <w:sz w:val="16"/>
-                <w:szCs w:val="16"/>
-              </w:rPr>
-              <w:t xml:space="preserve">BROADCAST INCIDENT_ALERT, INFORM CONGESTION_WARNING, INFORM PARAMETER_UPDATE</w:t>
-            </w:r>
-          </w:p>
-        </w:tc>
-        <w:tc>
-          <w:tcPr>
-            <w:tcW w:type="dxa" w:w="2076"/>
-            <w:tcBorders>
-              <w:top w:val="single" w:color="C9C7C1" w:sz="4"/>
-              <w:left w:val="single" w:color="C9C7C1" w:sz="4"/>
-              <w:bottom w:val="single" w:color="C9C7C1" w:sz="4"/>
-              <w:right w:val="single" w:color="C9C7C1" w:sz="4"/>
-            </w:tcBorders>
             <w:tcMar>
               <w:top w:type="dxa" w:w="60"/>
               <w:left w:type="dxa" w:w="100"/>
@@ -3486,7 +3302,7 @@
                 <w:sz w:val="17"/>
                 <w:szCs w:val="17"/>
               </w:rPr>
-              <w:t xml:space="preserve">Intersections cooperate (green-wave hand-off). Vehicles compete for road space and green time. The bus competes with cross traffic, and the intersection arbitrates.</w:t>
+              <w:t xml:space="preserve">Intersections cooperate (green-wave hand-off). Vehicles compete for road space and green time. The ambulance asks the intersection to override the normal signal order.</w:t>
             </w:r>
           </w:p>
         </w:tc>
@@ -4454,7 +4270,7 @@
                 <w:sz w:val="17"/>
                 <w:szCs w:val="17"/>
               </w:rPr>
-              <w:t xml:space="preserve">Bus</w:t>
+              <w:t xml:space="preserve">Coordinator</w:t>
             </w:r>
           </w:p>
         </w:tc>
@@ -4486,7 +4302,7 @@
                 <w:sz w:val="17"/>
                 <w:szCs w:val="17"/>
               </w:rPr>
-              <w:t xml:space="preserve">Utility-based negotiating agent</w:t>
+              <w:t xml:space="preserve">Learning agent</w:t>
             </w:r>
           </w:p>
         </w:tc>
@@ -4500,104 +4316,6 @@
               <w:right w:val="single" w:color="C9C7C1" w:sz="4"/>
             </w:tcBorders>
             <w:shd w:fill="F7F7F5" w:color="auto" w:val="clear"/>
-            <w:tcMar>
-              <w:top w:type="dxa" w:w="60"/>
-              <w:left w:type="dxa" w:w="100"/>
-              <w:bottom w:type="dxa" w:w="60"/>
-              <w:right w:type="dxa" w:w="100"/>
-            </w:tcMar>
-          </w:tcPr>
-          <w:p>
-            <w:pPr>
-              <w:spacing w:after="0"/>
-              <w:jc w:val="left"/>
-            </w:pPr>
-            <w:r>
-              <w:rPr>
-                <w:color w:val="000000"/>
-                <w:sz w:val="17"/>
-                <w:szCs w:val="17"/>
-              </w:rPr>
-              <w:t xml:space="preserve">Proposes priority. The outcome depends on the intersection's evaluation of cross-street cost.</w:t>
-            </w:r>
-          </w:p>
-        </w:tc>
-      </w:tr>
-      <w:tr>
-        <w:trPr>
-          <w:tblHeader w:val="false"/>
-        </w:trPr>
-        <w:tc>
-          <w:tcPr>
-            <w:tcW w:type="dxa" w:w="1400"/>
-            <w:tcBorders>
-              <w:top w:val="single" w:color="C9C7C1" w:sz="4"/>
-              <w:left w:val="single" w:color="C9C7C1" w:sz="4"/>
-              <w:bottom w:val="single" w:color="C9C7C1" w:sz="4"/>
-              <w:right w:val="single" w:color="C9C7C1" w:sz="4"/>
-            </w:tcBorders>
-            <w:tcMar>
-              <w:top w:type="dxa" w:w="60"/>
-              <w:left w:type="dxa" w:w="100"/>
-              <w:bottom w:type="dxa" w:w="60"/>
-              <w:right w:type="dxa" w:w="100"/>
-            </w:tcMar>
-          </w:tcPr>
-          <w:p>
-            <w:pPr>
-              <w:spacing w:after="0"/>
-              <w:jc w:val="left"/>
-            </w:pPr>
-            <w:r>
-              <w:rPr>
-                <w:color w:val="000000"/>
-                <w:sz w:val="17"/>
-                <w:szCs w:val="17"/>
-              </w:rPr>
-              <w:t xml:space="preserve">Coordinator</w:t>
-            </w:r>
-          </w:p>
-        </w:tc>
-        <w:tc>
-          <w:tcPr>
-            <w:tcW w:type="dxa" w:w="2600"/>
-            <w:tcBorders>
-              <w:top w:val="single" w:color="C9C7C1" w:sz="4"/>
-              <w:left w:val="single" w:color="C9C7C1" w:sz="4"/>
-              <w:bottom w:val="single" w:color="C9C7C1" w:sz="4"/>
-              <w:right w:val="single" w:color="C9C7C1" w:sz="4"/>
-            </w:tcBorders>
-            <w:tcMar>
-              <w:top w:type="dxa" w:w="60"/>
-              <w:left w:type="dxa" w:w="100"/>
-              <w:bottom w:type="dxa" w:w="60"/>
-              <w:right w:type="dxa" w:w="100"/>
-            </w:tcMar>
-          </w:tcPr>
-          <w:p>
-            <w:pPr>
-              <w:spacing w:after="0"/>
-              <w:jc w:val="left"/>
-            </w:pPr>
-            <w:r>
-              <w:rPr>
-                <w:color w:val="000000"/>
-                <w:sz w:val="17"/>
-                <w:szCs w:val="17"/>
-              </w:rPr>
-              <w:t xml:space="preserve">Learning agent</w:t>
-            </w:r>
-          </w:p>
-        </w:tc>
-        <w:tc>
-          <w:tcPr>
-            <w:tcW w:type="dxa" w:w="5026"/>
-            <w:tcBorders>
-              <w:top w:val="single" w:color="C9C7C1" w:sz="4"/>
-              <w:left w:val="single" w:color="C9C7C1" w:sz="4"/>
-              <w:bottom w:val="single" w:color="C9C7C1" w:sz="4"/>
-              <w:right w:val="single" w:color="C9C7C1" w:sz="4"/>
-            </w:tcBorders>
             <w:tcMar>
               <w:top w:type="dxa" w:w="60"/>
               <w:left w:type="dxa" w:w="100"/>
@@ -4643,7 +4361,7 @@
       <w:r>
         <w:drawing>
           <wp:inline distT="0" distB="0" distL="0" distR="0">
-            <wp:extent cx="5715000" cy="3562350"/>
+            <wp:extent cx="5715000" cy="3324225"/>
             <wp:effectExtent t="0" r="0" b="0" l="0"/>
             <wp:docPr id="1" name="fig" descr="Figure 1. Agents, owners and the messages that connect them" title="Figure 1. Agents, owners and the messages that connect them"/>
             <wp:cNvGraphicFramePr>
@@ -4668,7 +4386,7 @@
                   <pic:spPr bwMode="auto">
                     <a:xfrm>
                       <a:off x="0" y="0"/>
-                      <a:ext cx="5715000" cy="3562350"/>
+                      <a:ext cx="5715000" cy="3324225"/>
                     </a:xfrm>
                     <a:prstGeom prst="rect">
                       <a:avLst/>
@@ -9146,26 +8864,6 @@
     </w:p>
     <w:p>
       <w:pPr>
-        <w:pStyle w:val="ListParagraph"/>
-        <w:numPr>
-          <w:ilvl w:val="0"/>
-          <w:numId w:val="2"/>
-        </w:numPr>
-        <w:spacing w:after="60"/>
-      </w:pPr>
-      <w:r>
-        <w:rPr>
-          <w:b/>
-          <w:bCs/>
-        </w:rPr>
-        <w:t xml:space="preserve">Transit Signal Priority (fipa-propose).</w:t>
-      </w:r>
-      <w:r>
-        <w:t xml:space="preserve"> When its ETA is 12 s or less, the bus sends PROPOSE. The intersection accepts only if the cross-street queue is 6 or less and no ambulance is active. It then extends or advances the bus' green by at most 15 s, never cutting the minimum green. Otherwise it replies REJECT_PROPOSAL with a reason.</w:t>
-      </w:r>
-    </w:p>
-    <w:p>
-      <w:pPr>
         <w:pStyle w:val="Heading1"/>
         <w:pageBreakBefore/>
       </w:pPr>
@@ -10175,7 +9873,7 @@
         <w:spacing w:after="120" w:line="276"/>
       </w:pPr>
       <w:r>
-        <w:t xml:space="preserve">The simulator is synchronous and deterministic for a given seed (test IT-09). Each 1-second tick runs: (1) the Coordinator (telemetry, advisories), (2) every Intersection agent, (3) every Vehicle, Ambulance and Bus agent, (4) metrics. Every agent runs the same cycle in </w:t>
+        <w:t xml:space="preserve">The simulator is synchronous and deterministic for a given seed (test IT-09). Each 1-second tick runs: (1) the Coordinator (telemetry, advisories), (2) every Intersection agent, (3) every Vehicle and Ambulance agent, (4) metrics. Every agent runs the same cycle in </w:t>
       </w:r>
       <w:r>
         <w:rPr>
@@ -10672,7 +10370,7 @@
                 <w:sz w:val="16"/>
                 <w:szCs w:val="16"/>
               </w:rPr>
-              <w:t xml:space="preserve">PROPOSE</w:t>
+              <w:t xml:space="preserve">CANCEL</w:t>
             </w:r>
           </w:p>
         </w:tc>
@@ -10703,7 +10401,7 @@
                 <w:sz w:val="16"/>
                 <w:szCs w:val="16"/>
               </w:rPr>
-              <w:t xml:space="preserve">Bus -&gt; Intersection</w:t>
+              <w:t xml:space="preserve">Ambulance -&gt; Intersection</w:t>
             </w:r>
           </w:p>
         </w:tc>
@@ -10734,7 +10432,7 @@
                 <w:sz w:val="16"/>
                 <w:szCs w:val="16"/>
               </w:rPr>
-              <w:t xml:space="preserve">axis, ETA, passengers</w:t>
+              <w:t xml:space="preserve">cleared</w:t>
             </w:r>
           </w:p>
         </w:tc>
@@ -10765,7 +10463,7 @@
                 <w:sz w:val="16"/>
                 <w:szCs w:val="16"/>
               </w:rPr>
-              <w:t xml:space="preserve">Request for bounded priority</w:t>
+              <w:t xml:space="preserve">Release priority; Max-Pressure resumes</w:t>
             </w:r>
           </w:p>
         </w:tc>
@@ -10802,7 +10500,7 @@
                 <w:sz w:val="16"/>
                 <w:szCs w:val="16"/>
               </w:rPr>
-              <w:t xml:space="preserve">ACCEPT_ / REJECT_PROPOSAL</w:t>
+              <w:t xml:space="preserve">INFORM (green-wave)</w:t>
             </w:r>
           </w:p>
         </w:tc>
@@ -10834,7 +10532,7 @@
                 <w:sz w:val="16"/>
                 <w:szCs w:val="16"/>
               </w:rPr>
-              <w:t xml:space="preserve">Intersection -&gt; Bus</w:t>
+              <w:t xml:space="preserve">Intersection -&gt; neighbour</w:t>
             </w:r>
           </w:p>
         </w:tc>
@@ -10866,7 +10564,7 @@
                 <w:sz w:val="16"/>
                 <w:szCs w:val="16"/>
               </w:rPr>
-              <w:t xml:space="preserve">reason</w:t>
+              <w:t xml:space="preserve">axis, vehicles</w:t>
             </w:r>
           </w:p>
         </w:tc>
@@ -10898,7 +10596,7 @@
                 <w:sz w:val="16"/>
                 <w:szCs w:val="16"/>
               </w:rPr>
-              <w:t xml:space="preserve">Negotiation outcome</w:t>
+              <w:t xml:space="preserve">Neighbour extends green for the arriving platoon</w:t>
             </w:r>
           </w:p>
         </w:tc>
@@ -10934,7 +10632,7 @@
                 <w:sz w:val="16"/>
                 <w:szCs w:val="16"/>
               </w:rPr>
-              <w:t xml:space="preserve">CANCEL</w:t>
+              <w:t xml:space="preserve">BROADCAST INCIDENT_ALERT</w:t>
             </w:r>
           </w:p>
         </w:tc>
@@ -10965,7 +10663,7 @@
                 <w:sz w:val="16"/>
                 <w:szCs w:val="16"/>
               </w:rPr>
-              <w:t xml:space="preserve">Ambulance/Bus -&gt; Intersection</w:t>
+              <w:t xml:space="preserve">Coordinator -&gt; all</w:t>
             </w:r>
           </w:p>
         </w:tc>
@@ -10996,7 +10694,7 @@
                 <w:sz w:val="16"/>
                 <w:szCs w:val="16"/>
               </w:rPr>
-              <w:t xml:space="preserve">cleared</w:t>
+              <w:t xml:space="preserve">road, BLOCKED / SLOWED / CLEARED</w:t>
             </w:r>
           </w:p>
         </w:tc>
@@ -11027,7 +10725,7 @@
                 <w:sz w:val="16"/>
                 <w:szCs w:val="16"/>
               </w:rPr>
-              <w:t xml:space="preserve">Release priority; Max-Pressure resumes</w:t>
+              <w:t xml:space="preserve">Vehicles update beliefs and re-plan with A*</w:t>
             </w:r>
           </w:p>
         </w:tc>
@@ -11064,7 +10762,7 @@
                 <w:sz w:val="16"/>
                 <w:szCs w:val="16"/>
               </w:rPr>
-              <w:t xml:space="preserve">INFORM (green-wave)</w:t>
+              <w:t xml:space="preserve">INFORM CONGESTION_WARNING</w:t>
             </w:r>
           </w:p>
         </w:tc>
@@ -11096,7 +10794,7 @@
                 <w:sz w:val="16"/>
                 <w:szCs w:val="16"/>
               </w:rPr>
-              <w:t xml:space="preserve">Intersection -&gt; neighbour</w:t>
+              <w:t xml:space="preserve">Coordinator -&gt; all</w:t>
             </w:r>
           </w:p>
         </w:tc>
@@ -11128,7 +10826,7 @@
                 <w:sz w:val="16"/>
                 <w:szCs w:val="16"/>
               </w:rPr>
-              <w:t xml:space="preserve">axis, vehicles</w:t>
+              <w:t xml:space="preserve">index, hotspots</w:t>
             </w:r>
           </w:p>
         </w:tc>
@@ -11160,7 +10858,7 @@
                 <w:sz w:val="16"/>
                 <w:szCs w:val="16"/>
               </w:rPr>
-              <w:t xml:space="preserve">Neighbour extends green for the arriving platoon</w:t>
+              <w:t xml:space="preserve">Vehicles re-plan if they find a route at least 15% faster</w:t>
             </w:r>
           </w:p>
         </w:tc>
@@ -11196,7 +10894,7 @@
                 <w:sz w:val="16"/>
                 <w:szCs w:val="16"/>
               </w:rPr>
-              <w:t xml:space="preserve">BROADCAST INCIDENT_ALERT</w:t>
+              <w:t xml:space="preserve">INFORM PARAMETER_UPDATE</w:t>
             </w:r>
           </w:p>
         </w:tc>
@@ -11227,7 +10925,7 @@
                 <w:sz w:val="16"/>
                 <w:szCs w:val="16"/>
               </w:rPr>
-              <w:t xml:space="preserve">Coordinator -&gt; all</w:t>
+              <w:t xml:space="preserve">Coordinator -&gt; Intersections</w:t>
             </w:r>
           </w:p>
         </w:tc>
@@ -11258,7 +10956,7 @@
                 <w:sz w:val="16"/>
                 <w:szCs w:val="16"/>
               </w:rPr>
-              <w:t xml:space="preserve">road, BLOCKED / SLOWED / CLEARED</w:t>
+              <w:t xml:space="preserve">tuned parameters</w:t>
             </w:r>
           </w:p>
         </w:tc>
@@ -11289,268 +10987,6 @@
                 <w:sz w:val="16"/>
                 <w:szCs w:val="16"/>
               </w:rPr>
-              <w:t xml:space="preserve">Vehicles update beliefs and re-plan with A*</w:t>
-            </w:r>
-          </w:p>
-        </w:tc>
-      </w:tr>
-      <w:tr>
-        <w:trPr>
-          <w:tblHeader w:val="false"/>
-        </w:trPr>
-        <w:tc>
-          <w:tcPr>
-            <w:tcW w:type="dxa" w:w="2300"/>
-            <w:tcBorders>
-              <w:top w:val="single" w:color="C9C7C1" w:sz="4"/>
-              <w:left w:val="single" w:color="C9C7C1" w:sz="4"/>
-              <w:bottom w:val="single" w:color="C9C7C1" w:sz="4"/>
-              <w:right w:val="single" w:color="C9C7C1" w:sz="4"/>
-            </w:tcBorders>
-            <w:shd w:fill="F7F7F5" w:color="auto" w:val="clear"/>
-            <w:tcMar>
-              <w:top w:type="dxa" w:w="60"/>
-              <w:left w:type="dxa" w:w="100"/>
-              <w:bottom w:type="dxa" w:w="60"/>
-              <w:right w:type="dxa" w:w="100"/>
-            </w:tcMar>
-          </w:tcPr>
-          <w:p>
-            <w:pPr>
-              <w:spacing w:after="0"/>
-              <w:jc w:val="left"/>
-            </w:pPr>
-            <w:r>
-              <w:rPr>
-                <w:color w:val="000000"/>
-                <w:sz w:val="16"/>
-                <w:szCs w:val="16"/>
-              </w:rPr>
-              <w:t xml:space="preserve">INFORM CONGESTION_WARNING</w:t>
-            </w:r>
-          </w:p>
-        </w:tc>
-        <w:tc>
-          <w:tcPr>
-            <w:tcW w:type="dxa" w:w="2100"/>
-            <w:tcBorders>
-              <w:top w:val="single" w:color="C9C7C1" w:sz="4"/>
-              <w:left w:val="single" w:color="C9C7C1" w:sz="4"/>
-              <w:bottom w:val="single" w:color="C9C7C1" w:sz="4"/>
-              <w:right w:val="single" w:color="C9C7C1" w:sz="4"/>
-            </w:tcBorders>
-            <w:shd w:fill="F7F7F5" w:color="auto" w:val="clear"/>
-            <w:tcMar>
-              <w:top w:type="dxa" w:w="60"/>
-              <w:left w:type="dxa" w:w="100"/>
-              <w:bottom w:type="dxa" w:w="60"/>
-              <w:right w:type="dxa" w:w="100"/>
-            </w:tcMar>
-          </w:tcPr>
-          <w:p>
-            <w:pPr>
-              <w:spacing w:after="0"/>
-              <w:jc w:val="left"/>
-            </w:pPr>
-            <w:r>
-              <w:rPr>
-                <w:color w:val="000000"/>
-                <w:sz w:val="16"/>
-                <w:szCs w:val="16"/>
-              </w:rPr>
-              <w:t xml:space="preserve">Coordinator -&gt; all</w:t>
-            </w:r>
-          </w:p>
-        </w:tc>
-        <w:tc>
-          <w:tcPr>
-            <w:tcW w:type="dxa" w:w="1900"/>
-            <w:tcBorders>
-              <w:top w:val="single" w:color="C9C7C1" w:sz="4"/>
-              <w:left w:val="single" w:color="C9C7C1" w:sz="4"/>
-              <w:bottom w:val="single" w:color="C9C7C1" w:sz="4"/>
-              <w:right w:val="single" w:color="C9C7C1" w:sz="4"/>
-            </w:tcBorders>
-            <w:shd w:fill="F7F7F5" w:color="auto" w:val="clear"/>
-            <w:tcMar>
-              <w:top w:type="dxa" w:w="60"/>
-              <w:left w:type="dxa" w:w="100"/>
-              <w:bottom w:type="dxa" w:w="60"/>
-              <w:right w:type="dxa" w:w="100"/>
-            </w:tcMar>
-          </w:tcPr>
-          <w:p>
-            <w:pPr>
-              <w:spacing w:after="0"/>
-              <w:jc w:val="left"/>
-            </w:pPr>
-            <w:r>
-              <w:rPr>
-                <w:color w:val="000000"/>
-                <w:sz w:val="16"/>
-                <w:szCs w:val="16"/>
-              </w:rPr>
-              <w:t xml:space="preserve">index, hotspots</w:t>
-            </w:r>
-          </w:p>
-        </w:tc>
-        <w:tc>
-          <w:tcPr>
-            <w:tcW w:type="dxa" w:w="2726"/>
-            <w:tcBorders>
-              <w:top w:val="single" w:color="C9C7C1" w:sz="4"/>
-              <w:left w:val="single" w:color="C9C7C1" w:sz="4"/>
-              <w:bottom w:val="single" w:color="C9C7C1" w:sz="4"/>
-              <w:right w:val="single" w:color="C9C7C1" w:sz="4"/>
-            </w:tcBorders>
-            <w:shd w:fill="F7F7F5" w:color="auto" w:val="clear"/>
-            <w:tcMar>
-              <w:top w:type="dxa" w:w="60"/>
-              <w:left w:type="dxa" w:w="100"/>
-              <w:bottom w:type="dxa" w:w="60"/>
-              <w:right w:type="dxa" w:w="100"/>
-            </w:tcMar>
-          </w:tcPr>
-          <w:p>
-            <w:pPr>
-              <w:spacing w:after="0"/>
-              <w:jc w:val="left"/>
-            </w:pPr>
-            <w:r>
-              <w:rPr>
-                <w:color w:val="000000"/>
-                <w:sz w:val="16"/>
-                <w:szCs w:val="16"/>
-              </w:rPr>
-              <w:t xml:space="preserve">Vehicles re-plan if they find a route at least 15% faster</w:t>
-            </w:r>
-          </w:p>
-        </w:tc>
-      </w:tr>
-      <w:tr>
-        <w:trPr>
-          <w:tblHeader w:val="false"/>
-        </w:trPr>
-        <w:tc>
-          <w:tcPr>
-            <w:tcW w:type="dxa" w:w="2300"/>
-            <w:tcBorders>
-              <w:top w:val="single" w:color="C9C7C1" w:sz="4"/>
-              <w:left w:val="single" w:color="C9C7C1" w:sz="4"/>
-              <w:bottom w:val="single" w:color="C9C7C1" w:sz="4"/>
-              <w:right w:val="single" w:color="C9C7C1" w:sz="4"/>
-            </w:tcBorders>
-            <w:tcMar>
-              <w:top w:type="dxa" w:w="60"/>
-              <w:left w:type="dxa" w:w="100"/>
-              <w:bottom w:type="dxa" w:w="60"/>
-              <w:right w:type="dxa" w:w="100"/>
-            </w:tcMar>
-          </w:tcPr>
-          <w:p>
-            <w:pPr>
-              <w:spacing w:after="0"/>
-              <w:jc w:val="left"/>
-            </w:pPr>
-            <w:r>
-              <w:rPr>
-                <w:color w:val="000000"/>
-                <w:sz w:val="16"/>
-                <w:szCs w:val="16"/>
-              </w:rPr>
-              <w:t xml:space="preserve">INFORM PARAMETER_UPDATE</w:t>
-            </w:r>
-          </w:p>
-        </w:tc>
-        <w:tc>
-          <w:tcPr>
-            <w:tcW w:type="dxa" w:w="2100"/>
-            <w:tcBorders>
-              <w:top w:val="single" w:color="C9C7C1" w:sz="4"/>
-              <w:left w:val="single" w:color="C9C7C1" w:sz="4"/>
-              <w:bottom w:val="single" w:color="C9C7C1" w:sz="4"/>
-              <w:right w:val="single" w:color="C9C7C1" w:sz="4"/>
-            </w:tcBorders>
-            <w:tcMar>
-              <w:top w:type="dxa" w:w="60"/>
-              <w:left w:type="dxa" w:w="100"/>
-              <w:bottom w:type="dxa" w:w="60"/>
-              <w:right w:type="dxa" w:w="100"/>
-            </w:tcMar>
-          </w:tcPr>
-          <w:p>
-            <w:pPr>
-              <w:spacing w:after="0"/>
-              <w:jc w:val="left"/>
-            </w:pPr>
-            <w:r>
-              <w:rPr>
-                <w:color w:val="000000"/>
-                <w:sz w:val="16"/>
-                <w:szCs w:val="16"/>
-              </w:rPr>
-              <w:t xml:space="preserve">Coordinator -&gt; Intersections</w:t>
-            </w:r>
-          </w:p>
-        </w:tc>
-        <w:tc>
-          <w:tcPr>
-            <w:tcW w:type="dxa" w:w="1900"/>
-            <w:tcBorders>
-              <w:top w:val="single" w:color="C9C7C1" w:sz="4"/>
-              <w:left w:val="single" w:color="C9C7C1" w:sz="4"/>
-              <w:bottom w:val="single" w:color="C9C7C1" w:sz="4"/>
-              <w:right w:val="single" w:color="C9C7C1" w:sz="4"/>
-            </w:tcBorders>
-            <w:tcMar>
-              <w:top w:type="dxa" w:w="60"/>
-              <w:left w:type="dxa" w:w="100"/>
-              <w:bottom w:type="dxa" w:w="60"/>
-              <w:right w:type="dxa" w:w="100"/>
-            </w:tcMar>
-          </w:tcPr>
-          <w:p>
-            <w:pPr>
-              <w:spacing w:after="0"/>
-              <w:jc w:val="left"/>
-            </w:pPr>
-            <w:r>
-              <w:rPr>
-                <w:color w:val="000000"/>
-                <w:sz w:val="16"/>
-                <w:szCs w:val="16"/>
-              </w:rPr>
-              <w:t xml:space="preserve">tuned parameters</w:t>
-            </w:r>
-          </w:p>
-        </w:tc>
-        <w:tc>
-          <w:tcPr>
-            <w:tcW w:type="dxa" w:w="2726"/>
-            <w:tcBorders>
-              <w:top w:val="single" w:color="C9C7C1" w:sz="4"/>
-              <w:left w:val="single" w:color="C9C7C1" w:sz="4"/>
-              <w:bottom w:val="single" w:color="C9C7C1" w:sz="4"/>
-              <w:right w:val="single" w:color="C9C7C1" w:sz="4"/>
-            </w:tcBorders>
-            <w:tcMar>
-              <w:top w:type="dxa" w:w="60"/>
-              <w:left w:type="dxa" w:w="100"/>
-              <w:bottom w:type="dxa" w:w="60"/>
-              <w:right w:type="dxa" w:w="100"/>
-            </w:tcMar>
-          </w:tcPr>
-          <w:p>
-            <w:pPr>
-              <w:spacing w:after="0"/>
-              <w:jc w:val="left"/>
-            </w:pPr>
-            <w:r>
-              <w:rPr>
-                <w:color w:val="000000"/>
-                <w:sz w:val="16"/>
-                <w:szCs w:val="16"/>
-              </w:rPr>
               <w:t xml:space="preserve">Controllers adopt the hill-climbing result</w:t>
             </w:r>
           </w:p>
@@ -11575,17 +11011,7 @@
         <w:spacing w:after="120" w:line="276"/>
       </w:pPr>
       <w:r>
-        <w:t xml:space="preserve">In the demo run an ambulance, a bus and an accident overlap, and the agents resolve the conflict themselves. The bus' proposal is </w:t>
-      </w:r>
-      <w:r>
-        <w:rPr>
-          <w:b/>
-          <w:bCs/>
-        </w:rPr>
-        <w:t xml:space="preserve">rejected</w:t>
-      </w:r>
-      <w:r>
-        <w:t xml:space="preserve"> while the ambulance holds INT_10. The bus had already avoided the slowed road INT_10-&gt;INT_11 because of the TMC broadcast, and its later proposals are accepted.</w:t>
+        <w:t xml:space="preserve">In the demo run the ambulance drives S0 to N2 while an accident closes road J01-J11. In our system the ambulance sends PREEMPT_OVERRIDE to each junction on its route (about 12 to 15 s before it arrives), the junction replies AGREE and turns green through a 3 s yellow, and the ambulance sends CANCEL once it has crossed so that Max-Pressure resumes. The accident alert is a single broadcast from the traffic centre.</w:t>
       </w:r>
     </w:p>
     <w:p>
@@ -11596,7 +11022,7 @@
       <w:r>
         <w:drawing>
           <wp:inline distT="0" distB="0" distL="0" distR="0">
-            <wp:extent cx="5715000" cy="3257550"/>
+            <wp:extent cx="5715000" cy="3314700"/>
             <wp:effectExtent t="0" r="0" b="0" l="0"/>
             <wp:docPr id="1" name="fig" descr="Figure 4. Message sequence recorded from the demo (results/protocol_trace.txt)" title="Figure 4. Message sequence recorded from the demo (results/protocol_trace.txt)"/>
             <wp:cNvGraphicFramePr>
@@ -11621,7 +11047,7 @@
                   <pic:spPr bwMode="auto">
                     <a:xfrm>
                       <a:off x="0" y="0"/>
-                      <a:ext cx="5715000" cy="3257550"/>
+                      <a:ext cx="5715000" cy="3314700"/>
                     </a:xfrm>
                     <a:prstGeom prst="rect">
                       <a:avLst/>
@@ -11662,7 +11088,27 @@
         <w:t xml:space="preserve">The demo page</w:t>
       </w:r>
       <w:r>
-        <w:t xml:space="preserve"> (python run_demo.py) shows one thing clearly: the original route of a car and how it adjusts. Six cars start on their cheapest A* route. At t = 10 s an accident closes road J01-J11 and the traffic centre broadcasts INCIDENT_ALERT. Only the cars that had that road on their route (Car 1 and Car 5) run A* again; the other four carry on unchanged.</w:t>
+        <w:t xml:space="preserve"> (python run_demo.py) runs the same city twice with identical traffic and the identical accident. </w:t>
+      </w:r>
+      <w:r>
+        <w:rPr>
+          <w:b/>
+          <w:bCs/>
+        </w:rPr>
+        <w:t xml:space="preserve">Conventional</w:t>
+      </w:r>
+      <w:r>
+        <w:t xml:space="preserve"> (left): fixed-time signals, drivers only change route when the closed road is the very next one, the ambulance waits at red lights. </w:t>
+      </w:r>
+      <w:r>
+        <w:rPr>
+          <w:b/>
+          <w:bCs/>
+        </w:rPr>
+        <w:t xml:space="preserve">Ours</w:t>
+      </w:r>
+      <w:r>
+        <w:t xml:space="preserve"> (right): Max-Pressure signals, the traffic centre broadcasts the accident so affected cars run A* again, and the ambulance gets a green corridor. Click any car to see its original route (dashed) and its new route (solid) with the reason. Accident roads can be added or removed by clicking the roads.</w:t>
       </w:r>
     </w:p>
     <w:p>
@@ -11673,9 +11119,9 @@
       <w:r>
         <w:drawing>
           <wp:inline distT="0" distB="0" distL="0" distR="0">
-            <wp:extent cx="4476750" cy="3095625"/>
+            <wp:extent cx="5143500" cy="3438525"/>
             <wp:effectExtent t="0" r="0" b="0" l="0"/>
-            <wp:docPr id="1" name="fig" descr="Figure 5a. Before the accident: Car 1 follows its original route (dashed) straight down column 1" title="Figure 5a. Before the accident: Car 1 follows its original route (dashed) straight down column 1"/>
+            <wp:docPr id="1" name="fig" descr="Figure 5a. Demo before the accident: both cities, same cars, same traffic" title="Figure 5a. Demo before the accident: both cities, same cars, same traffic"/>
             <wp:cNvGraphicFramePr>
               <a:graphicFrameLocks xmlns:a="http://schemas.openxmlformats.org/drawingml/2006/main" noChangeAspect="1"/>
             </wp:cNvGraphicFramePr>
@@ -11698,7 +11144,7 @@
                   <pic:spPr bwMode="auto">
                     <a:xfrm>
                       <a:off x="0" y="0"/>
-                      <a:ext cx="4476750" cy="3095625"/>
+                      <a:ext cx="5143500" cy="3438525"/>
                     </a:xfrm>
                     <a:prstGeom prst="rect">
                       <a:avLst/>
@@ -11724,7 +11170,7 @@
           <w:sz w:val="18"/>
           <w:szCs w:val="18"/>
         </w:rPr>
-        <w:t xml:space="preserve">Figure 5a. Before the accident: Car 1 follows its original route (dashed) straight down column 1</w:t>
+        <w:t xml:space="preserve">Figure 5a. Demo before the accident: both cities, same cars, same traffic</w:t>
       </w:r>
     </w:p>
     <w:p>
@@ -11735,9 +11181,9 @@
       <w:r>
         <w:drawing>
           <wp:inline distT="0" distB="0" distL="0" distR="0">
-            <wp:extent cx="4476750" cy="3095625"/>
+            <wp:extent cx="5143500" cy="3438525"/>
             <wp:effectExtent t="0" r="0" b="0" l="0"/>
-            <wp:docPr id="1" name="fig" descr="Figure 5b. After the accident: Car 1 has switched to a new route (solid) around the closed road; the panel states why" title="Figure 5b. After the accident: Car 1 has switched to a new route (solid) around the closed road; the panel states why"/>
+            <wp:docPr id="1" name="fig" descr="Figure 5b. After the accident: the ambulance is already ahead in our city; Car 1 has re-routed around the closed road" title="Figure 5b. After the accident: the ambulance is already ahead in our city; Car 1 has re-routed around the closed road"/>
             <wp:cNvGraphicFramePr>
               <a:graphicFrameLocks xmlns:a="http://schemas.openxmlformats.org/drawingml/2006/main" noChangeAspect="1"/>
             </wp:cNvGraphicFramePr>
@@ -11760,7 +11206,7 @@
                   <pic:spPr bwMode="auto">
                     <a:xfrm>
                       <a:off x="0" y="0"/>
-                      <a:ext cx="4476750" cy="3095625"/>
+                      <a:ext cx="5143500" cy="3438525"/>
                     </a:xfrm>
                     <a:prstGeom prst="rect">
                       <a:avLst/>
@@ -11786,7 +11232,7 @@
           <w:sz w:val="18"/>
           <w:szCs w:val="18"/>
         </w:rPr>
-        <w:t xml:space="preserve">Figure 5b. After the accident: Car 1 has switched to a new route (solid) around the closed road; the panel states why</w:t>
+        <w:t xml:space="preserve">Figure 5b. After the accident: the ambulance is already ahead in our city; Car 1 has re-routed around the closed road</w:t>
       </w:r>
     </w:p>
     <w:p>
@@ -14765,7 +14211,35 @@
         <w:pStyle w:val="Heading2"/>
       </w:pPr>
       <w:r>
-        <w:t xml:space="preserve">S5. Bus Transit Signal Priority</w:t>
+        <w:t xml:space="preserve">S5. Conventional city vs our system (accident + ambulance)</w:t>
+      </w:r>
+    </w:p>
+    <w:p>
+      <w:pPr>
+        <w:spacing w:after="120" w:line="276"/>
+      </w:pPr>
+      <w:r>
+        <w:t xml:space="preserve">Same 3x3 city, same random traffic (5 seeds), same accident (J01-J11 closed at t = 10 s), one ambulance (S0 to N2). </w:t>
+      </w:r>
+      <w:r>
+        <w:rPr>
+          <w:b/>
+          <w:bCs/>
+        </w:rPr>
+        <w:t xml:space="preserve">Conventional</w:t>
+      </w:r>
+      <w:r>
+        <w:t xml:space="preserve"> = fixed-time signals, drivers re-route only when the closed road is the next one, no preemption. </w:t>
+      </w:r>
+      <w:r>
+        <w:rPr>
+          <w:b/>
+          <w:bCs/>
+        </w:rPr>
+        <w:t xml:space="preserve">Ours</w:t>
+      </w:r>
+      <w:r>
+        <w:t xml:space="preserve"> = Max-Pressure, accident broadcast with A* re-planning, ambulance preemption.</w:t>
       </w:r>
     </w:p>
     <w:tbl>
@@ -14781,12 +14255,11 @@
         </w:tblBorders>
       </w:tblPr>
       <w:tblGrid>
-        <w:gridCol w:w="2800"/>
-        <w:gridCol w:w="1150"/>
-        <w:gridCol w:w="1150"/>
-        <w:gridCol w:w="1000"/>
-        <w:gridCol w:w="1000"/>
-        <w:gridCol w:w="1926"/>
+        <w:gridCol w:w="2600"/>
+        <w:gridCol w:w="1500"/>
+        <w:gridCol w:w="1800"/>
+        <w:gridCol w:w="1700"/>
+        <w:gridCol w:w="1426"/>
       </w:tblGrid>
       <w:tr>
         <w:trPr>
@@ -14794,7 +14267,7 @@
         </w:trPr>
         <w:tc>
           <w:tcPr>
-            <w:tcW w:type="dxa" w:w="2800"/>
+            <w:tcW w:type="dxa" w:w="2600"/>
             <w:tcBorders>
               <w:top w:val="single" w:color="C9C7C1" w:sz="4"/>
               <w:left w:val="single" w:color="C9C7C1" w:sz="4"/>
@@ -14819,16 +14292,16 @@
                 <w:b/>
                 <w:bCs/>
                 <w:color w:val="FFFFFF"/>
-                <w:sz w:val="16"/>
-                <w:szCs w:val="16"/>
-              </w:rPr>
-              <w:t xml:space="preserve">Case</w:t>
-            </w:r>
-          </w:p>
-        </w:tc>
-        <w:tc>
-          <w:tcPr>
-            <w:tcW w:type="dxa" w:w="1150"/>
+                <w:sz w:val="17"/>
+                <w:szCs w:val="17"/>
+              </w:rPr>
+              <w:t xml:space="preserve">System</w:t>
+            </w:r>
+          </w:p>
+        </w:tc>
+        <w:tc>
+          <w:tcPr>
+            <w:tcW w:type="dxa" w:w="1500"/>
             <w:tcBorders>
               <w:top w:val="single" w:color="C9C7C1" w:sz="4"/>
               <w:left w:val="single" w:color="C9C7C1" w:sz="4"/>
@@ -14853,16 +14326,16 @@
                 <w:b/>
                 <w:bCs/>
                 <w:color w:val="FFFFFF"/>
-                <w:sz w:val="16"/>
-                <w:szCs w:val="16"/>
-              </w:rPr>
-              <w:t xml:space="preserve">Bus travel (s)</w:t>
-            </w:r>
-          </w:p>
-        </w:tc>
-        <w:tc>
-          <w:tcPr>
-            <w:tcW w:type="dxa" w:w="1150"/>
+                <w:sz w:val="17"/>
+                <w:szCs w:val="17"/>
+              </w:rPr>
+              <w:t xml:space="preserve">Ambulance trip (s)</w:t>
+            </w:r>
+          </w:p>
+        </w:tc>
+        <w:tc>
+          <w:tcPr>
+            <w:tcW w:type="dxa" w:w="1800"/>
             <w:tcBorders>
               <w:top w:val="single" w:color="C9C7C1" w:sz="4"/>
               <w:left w:val="single" w:color="C9C7C1" w:sz="4"/>
@@ -14887,16 +14360,16 @@
                 <w:b/>
                 <w:bCs/>
                 <w:color w:val="FFFFFF"/>
-                <w:sz w:val="16"/>
-                <w:szCs w:val="16"/>
-              </w:rPr>
-              <w:t xml:space="preserve">Car wait (s)</w:t>
-            </w:r>
-          </w:p>
-        </w:tc>
-        <w:tc>
-          <w:tcPr>
-            <w:tcW w:type="dxa" w:w="1000"/>
+                <w:sz w:val="17"/>
+                <w:szCs w:val="17"/>
+              </w:rPr>
+              <w:t xml:space="preserve">Ambulance wait at red (s)</w:t>
+            </w:r>
+          </w:p>
+        </w:tc>
+        <w:tc>
+          <w:tcPr>
+            <w:tcW w:type="dxa" w:w="1700"/>
             <w:tcBorders>
               <w:top w:val="single" w:color="C9C7C1" w:sz="4"/>
               <w:left w:val="single" w:color="C9C7C1" w:sz="4"/>
@@ -14921,16 +14394,16 @@
                 <w:b/>
                 <w:bCs/>
                 <w:color w:val="FFFFFF"/>
-                <w:sz w:val="16"/>
-                <w:szCs w:val="16"/>
-              </w:rPr>
-              <w:t xml:space="preserve">Accepted</w:t>
-            </w:r>
-          </w:p>
-        </w:tc>
-        <w:tc>
-          <w:tcPr>
-            <w:tcW w:type="dxa" w:w="1000"/>
+                <w:sz w:val="17"/>
+                <w:szCs w:val="17"/>
+              </w:rPr>
+              <w:t xml:space="preserve">Avg wait per car (s)</w:t>
+            </w:r>
+          </w:p>
+        </w:tc>
+        <w:tc>
+          <w:tcPr>
+            <w:tcW w:type="dxa" w:w="1426"/>
             <w:tcBorders>
               <w:top w:val="single" w:color="C9C7C1" w:sz="4"/>
               <w:left w:val="single" w:color="C9C7C1" w:sz="4"/>
@@ -14955,44 +14428,10 @@
                 <w:b/>
                 <w:bCs/>
                 <w:color w:val="FFFFFF"/>
-                <w:sz w:val="16"/>
-                <w:szCs w:val="16"/>
-              </w:rPr>
-              <w:t xml:space="preserve">Rejected</w:t>
-            </w:r>
-          </w:p>
-        </w:tc>
-        <w:tc>
-          <w:tcPr>
-            <w:tcW w:type="dxa" w:w="1926"/>
-            <w:tcBorders>
-              <w:top w:val="single" w:color="C9C7C1" w:sz="4"/>
-              <w:left w:val="single" w:color="C9C7C1" w:sz="4"/>
-              <w:bottom w:val="single" w:color="C9C7C1" w:sz="4"/>
-              <w:right w:val="single" w:color="C9C7C1" w:sz="4"/>
-            </w:tcBorders>
-            <w:shd w:fill="1F3864" w:color="auto" w:val="clear"/>
-            <w:tcMar>
-              <w:top w:type="dxa" w:w="60"/>
-              <w:left w:type="dxa" w:w="100"/>
-              <w:bottom w:type="dxa" w:w="60"/>
-              <w:right w:type="dxa" w:w="100"/>
-            </w:tcMar>
-          </w:tcPr>
-          <w:p>
-            <w:pPr>
-              <w:spacing w:after="0"/>
-              <w:jc w:val="center"/>
-            </w:pPr>
-            <w:r>
-              <w:rPr>
-                <w:b/>
-                <w:bCs/>
-                <w:color w:val="FFFFFF"/>
-                <w:sz w:val="16"/>
-                <w:szCs w:val="16"/>
-              </w:rPr>
-              <w:t xml:space="preserve">Net passenger-s saved / run</w:t>
+                <w:sz w:val="17"/>
+                <w:szCs w:val="17"/>
+              </w:rPr>
+              <w:t xml:space="preserve">Cars arrived (%)</w:t>
             </w:r>
           </w:p>
         </w:tc>
@@ -15003,52 +14442,38 @@
         </w:trPr>
         <w:tc>
           <w:tcPr>
-            <w:tcW w:type="dxa" w:w="2800"/>
-            <w:tcBorders>
-              <w:top w:val="single" w:color="C9C7C1" w:sz="4"/>
-              <w:left w:val="single" w:color="C9C7C1" w:sz="4"/>
-              <w:bottom w:val="single" w:color="C9C7C1" w:sz="4"/>
-              <w:right w:val="single" w:color="C9C7C1" w:sz="4"/>
-            </w:tcBorders>
-            <w:tcMar>
-              <w:top w:type="dxa" w:w="60"/>
-              <w:left w:type="dxa" w:w="100"/>
-              <w:bottom w:type="dxa" w:w="60"/>
-              <w:right w:type="dxa" w:w="100"/>
-            </w:tcMar>
-          </w:tcPr>
-          <w:p>
-            <w:pPr>
-              <w:spacing w:after="0"/>
-              <w:jc w:val="left"/>
-            </w:pPr>
-            <w:r>
-              <w:rPr>
-                <w:color w:val="000000"/>
-                <w:sz w:val="16"/>
-                <w:szCs w:val="16"/>
-              </w:rPr>
-              <w:t xml:space="preserve">light cross-traffic (0.2 veh/s)</w:t>
-            </w:r>
-          </w:p>
-          <w:p>
-            <w:pPr>
-              <w:spacing w:after="0"/>
-              <w:jc w:val="left"/>
-            </w:pPr>
-            <w:r>
-              <w:rPr>
-                <w:color w:val="000000"/>
-                <w:sz w:val="16"/>
-                <w:szCs w:val="16"/>
-              </w:rPr>
-              <w:t xml:space="preserve">TSP OFF</w:t>
-            </w:r>
-          </w:p>
-        </w:tc>
-        <w:tc>
-          <w:tcPr>
-            <w:tcW w:type="dxa" w:w="1150"/>
+            <w:tcW w:type="dxa" w:w="2600"/>
+            <w:tcBorders>
+              <w:top w:val="single" w:color="C9C7C1" w:sz="4"/>
+              <w:left w:val="single" w:color="C9C7C1" w:sz="4"/>
+              <w:bottom w:val="single" w:color="C9C7C1" w:sz="4"/>
+              <w:right w:val="single" w:color="C9C7C1" w:sz="4"/>
+            </w:tcBorders>
+            <w:tcMar>
+              <w:top w:type="dxa" w:w="60"/>
+              <w:left w:type="dxa" w:w="100"/>
+              <w:bottom w:type="dxa" w:w="60"/>
+              <w:right w:type="dxa" w:w="100"/>
+            </w:tcMar>
+          </w:tcPr>
+          <w:p>
+            <w:pPr>
+              <w:spacing w:after="0"/>
+              <w:jc w:val="left"/>
+            </w:pPr>
+            <w:r>
+              <w:rPr>
+                <w:color w:val="000000"/>
+                <w:sz w:val="17"/>
+                <w:szCs w:val="17"/>
+              </w:rPr>
+              <w:t xml:space="preserve">Conventional</w:t>
+            </w:r>
+          </w:p>
+        </w:tc>
+        <w:tc>
+          <w:tcPr>
+            <w:tcW w:type="dxa" w:w="1500"/>
             <w:tcBorders>
               <w:top w:val="single" w:color="C9C7C1" w:sz="4"/>
               <w:left w:val="single" w:color="C9C7C1" w:sz="4"/>
@@ -15070,16 +14495,16 @@
             <w:r>
               <w:rPr>
                 <w:color w:val="000000"/>
-                <w:sz w:val="16"/>
-                <w:szCs w:val="16"/>
-              </w:rPr>
-              <w:t xml:space="preserve">63.8</w:t>
-            </w:r>
-          </w:p>
-        </w:tc>
-        <w:tc>
-          <w:tcPr>
-            <w:tcW w:type="dxa" w:w="1150"/>
+                <w:sz w:val="17"/>
+                <w:szCs w:val="17"/>
+              </w:rPr>
+              <w:t xml:space="preserve">126.0</w:t>
+            </w:r>
+          </w:p>
+        </w:tc>
+        <w:tc>
+          <w:tcPr>
+            <w:tcW w:type="dxa" w:w="1800"/>
             <w:tcBorders>
               <w:top w:val="single" w:color="C9C7C1" w:sz="4"/>
               <w:left w:val="single" w:color="C9C7C1" w:sz="4"/>
@@ -15101,16 +14526,16 @@
             <w:r>
               <w:rPr>
                 <w:color w:val="000000"/>
-                <w:sz w:val="16"/>
-                <w:szCs w:val="16"/>
-              </w:rPr>
-              <w:t xml:space="preserve">2.41</w:t>
-            </w:r>
-          </w:p>
-        </w:tc>
-        <w:tc>
-          <w:tcPr>
-            <w:tcW w:type="dxa" w:w="1000"/>
+                <w:sz w:val="17"/>
+                <w:szCs w:val="17"/>
+              </w:rPr>
+              <w:t xml:space="preserve">47.0</w:t>
+            </w:r>
+          </w:p>
+        </w:tc>
+        <w:tc>
+          <w:tcPr>
+            <w:tcW w:type="dxa" w:w="1700"/>
             <w:tcBorders>
               <w:top w:val="single" w:color="C9C7C1" w:sz="4"/>
               <w:left w:val="single" w:color="C9C7C1" w:sz="4"/>
@@ -15132,16 +14557,16 @@
             <w:r>
               <w:rPr>
                 <w:color w:val="000000"/>
-                <w:sz w:val="16"/>
-                <w:szCs w:val="16"/>
-              </w:rPr>
-              <w:t xml:space="preserve">0</w:t>
-            </w:r>
-          </w:p>
-        </w:tc>
-        <w:tc>
-          <w:tcPr>
-            <w:tcW w:type="dxa" w:w="1000"/>
+                <w:sz w:val="17"/>
+                <w:szCs w:val="17"/>
+              </w:rPr>
+              <w:t xml:space="preserve">21.25</w:t>
+            </w:r>
+          </w:p>
+        </w:tc>
+        <w:tc>
+          <w:tcPr>
+            <w:tcW w:type="dxa" w:w="1426"/>
             <w:tcBorders>
               <w:top w:val="single" w:color="C9C7C1" w:sz="4"/>
               <w:left w:val="single" w:color="C9C7C1" w:sz="4"/>
@@ -15163,41 +14588,10 @@
             <w:r>
               <w:rPr>
                 <w:color w:val="000000"/>
-                <w:sz w:val="16"/>
-                <w:szCs w:val="16"/>
-              </w:rPr>
-              <w:t xml:space="preserve">0</w:t>
-            </w:r>
-          </w:p>
-        </w:tc>
-        <w:tc>
-          <w:tcPr>
-            <w:tcW w:type="dxa" w:w="1926"/>
-            <w:tcBorders>
-              <w:top w:val="single" w:color="C9C7C1" w:sz="4"/>
-              <w:left w:val="single" w:color="C9C7C1" w:sz="4"/>
-              <w:bottom w:val="single" w:color="C9C7C1" w:sz="4"/>
-              <w:right w:val="single" w:color="C9C7C1" w:sz="4"/>
-            </w:tcBorders>
-            <w:tcMar>
-              <w:top w:type="dxa" w:w="60"/>
-              <w:left w:type="dxa" w:w="100"/>
-              <w:bottom w:type="dxa" w:w="60"/>
-              <w:right w:type="dxa" w:w="100"/>
-            </w:tcMar>
-          </w:tcPr>
-          <w:p>
-            <w:pPr>
-              <w:spacing w:after="0"/>
-              <w:jc w:val="center"/>
-            </w:pPr>
-            <w:r>
-              <w:rPr>
-                <w:color w:val="000000"/>
-                <w:sz w:val="16"/>
-                <w:szCs w:val="16"/>
-              </w:rPr>
-              <w:t xml:space="preserve">-</w:t>
+                <w:sz w:val="17"/>
+                <w:szCs w:val="17"/>
+              </w:rPr>
+              <w:t xml:space="preserve">99.1</w:t>
             </w:r>
           </w:p>
         </w:tc>
@@ -15208,60 +14602,46 @@
         </w:trPr>
         <w:tc>
           <w:tcPr>
-            <w:tcW w:type="dxa" w:w="2800"/>
-            <w:tcBorders>
-              <w:top w:val="single" w:color="C9C7C1" w:sz="4"/>
-              <w:left w:val="single" w:color="C9C7C1" w:sz="4"/>
-              <w:bottom w:val="single" w:color="C9C7C1" w:sz="4"/>
-              <w:right w:val="single" w:color="C9C7C1" w:sz="4"/>
-            </w:tcBorders>
-            <w:shd w:fill="F7F7F5" w:color="auto" w:val="clear"/>
-            <w:tcMar>
-              <w:top w:type="dxa" w:w="60"/>
-              <w:left w:type="dxa" w:w="100"/>
-              <w:bottom w:type="dxa" w:w="60"/>
-              <w:right w:type="dxa" w:w="100"/>
-            </w:tcMar>
-          </w:tcPr>
-          <w:p>
-            <w:pPr>
-              <w:spacing w:after="0"/>
-              <w:jc w:val="left"/>
-            </w:pPr>
-            <w:r>
-              <w:rPr>
-                <w:color w:val="000000"/>
-                <w:sz w:val="16"/>
-                <w:szCs w:val="16"/>
-              </w:rPr>
-              <w:t xml:space="preserve">light cross-traffic (0.2 veh/s)</w:t>
-            </w:r>
-          </w:p>
-          <w:p>
-            <w:pPr>
-              <w:spacing w:after="0"/>
-              <w:jc w:val="left"/>
-            </w:pPr>
-            <w:r>
-              <w:rPr>
-                <w:color w:val="000000"/>
-                <w:sz w:val="16"/>
-                <w:szCs w:val="16"/>
-              </w:rPr>
-              <w:t xml:space="preserve">TSP ON</w:t>
-            </w:r>
-          </w:p>
-        </w:tc>
-        <w:tc>
-          <w:tcPr>
-            <w:tcW w:type="dxa" w:w="1150"/>
-            <w:tcBorders>
-              <w:top w:val="single" w:color="C9C7C1" w:sz="4"/>
-              <w:left w:val="single" w:color="C9C7C1" w:sz="4"/>
-              <w:bottom w:val="single" w:color="C9C7C1" w:sz="4"/>
-              <w:right w:val="single" w:color="C9C7C1" w:sz="4"/>
-            </w:tcBorders>
-            <w:shd w:fill="F7F7F5" w:color="auto" w:val="clear"/>
+            <w:tcW w:type="dxa" w:w="2600"/>
+            <w:tcBorders>
+              <w:top w:val="single" w:color="C9C7C1" w:sz="4"/>
+              <w:left w:val="single" w:color="C9C7C1" w:sz="4"/>
+              <w:bottom w:val="single" w:color="C9C7C1" w:sz="4"/>
+              <w:right w:val="single" w:color="C9C7C1" w:sz="4"/>
+            </w:tcBorders>
+            <w:shd w:fill="E3EEFB" w:color="auto" w:val="clear"/>
+            <w:tcMar>
+              <w:top w:type="dxa" w:w="60"/>
+              <w:left w:type="dxa" w:w="100"/>
+              <w:bottom w:type="dxa" w:w="60"/>
+              <w:right w:type="dxa" w:w="100"/>
+            </w:tcMar>
+          </w:tcPr>
+          <w:p>
+            <w:pPr>
+              <w:spacing w:after="0"/>
+              <w:jc w:val="left"/>
+            </w:pPr>
+            <w:r>
+              <w:rPr>
+                <w:color w:val="000000"/>
+                <w:sz w:val="17"/>
+                <w:szCs w:val="17"/>
+              </w:rPr>
+              <w:t xml:space="preserve">Ours (STMS)</w:t>
+            </w:r>
+          </w:p>
+        </w:tc>
+        <w:tc>
+          <w:tcPr>
+            <w:tcW w:type="dxa" w:w="1500"/>
+            <w:tcBorders>
+              <w:top w:val="single" w:color="C9C7C1" w:sz="4"/>
+              <w:left w:val="single" w:color="C9C7C1" w:sz="4"/>
+              <w:bottom w:val="single" w:color="C9C7C1" w:sz="4"/>
+              <w:right w:val="single" w:color="C9C7C1" w:sz="4"/>
+            </w:tcBorders>
+            <w:shd w:fill="E3EEFB" w:color="auto" w:val="clear"/>
             <w:tcMar>
               <w:top w:type="dxa" w:w="60"/>
               <w:left w:type="dxa" w:w="100"/>
@@ -15277,23 +14657,23 @@
             <w:r>
               <w:rPr>
                 <w:color w:val="000000"/>
-                <w:sz w:val="16"/>
-                <w:szCs w:val="16"/>
-              </w:rPr>
-              <w:t xml:space="preserve">58.0</w:t>
-            </w:r>
-          </w:p>
-        </w:tc>
-        <w:tc>
-          <w:tcPr>
-            <w:tcW w:type="dxa" w:w="1150"/>
-            <w:tcBorders>
-              <w:top w:val="single" w:color="C9C7C1" w:sz="4"/>
-              <w:left w:val="single" w:color="C9C7C1" w:sz="4"/>
-              <w:bottom w:val="single" w:color="C9C7C1" w:sz="4"/>
-              <w:right w:val="single" w:color="C9C7C1" w:sz="4"/>
-            </w:tcBorders>
-            <w:shd w:fill="F7F7F5" w:color="auto" w:val="clear"/>
+                <w:sz w:val="17"/>
+                <w:szCs w:val="17"/>
+              </w:rPr>
+              <w:t xml:space="preserve">73.0</w:t>
+            </w:r>
+          </w:p>
+        </w:tc>
+        <w:tc>
+          <w:tcPr>
+            <w:tcW w:type="dxa" w:w="1800"/>
+            <w:tcBorders>
+              <w:top w:val="single" w:color="C9C7C1" w:sz="4"/>
+              <w:left w:val="single" w:color="C9C7C1" w:sz="4"/>
+              <w:bottom w:val="single" w:color="C9C7C1" w:sz="4"/>
+              <w:right w:val="single" w:color="C9C7C1" w:sz="4"/>
+            </w:tcBorders>
+            <w:shd w:fill="E3EEFB" w:color="auto" w:val="clear"/>
             <w:tcMar>
               <w:top w:type="dxa" w:w="60"/>
               <w:left w:type="dxa" w:w="100"/>
@@ -15309,23 +14689,23 @@
             <w:r>
               <w:rPr>
                 <w:color w:val="000000"/>
-                <w:sz w:val="16"/>
-                <w:szCs w:val="16"/>
-              </w:rPr>
-              <w:t xml:space="preserve">4.76</w:t>
-            </w:r>
-          </w:p>
-        </w:tc>
-        <w:tc>
-          <w:tcPr>
-            <w:tcW w:type="dxa" w:w="1000"/>
-            <w:tcBorders>
-              <w:top w:val="single" w:color="C9C7C1" w:sz="4"/>
-              <w:left w:val="single" w:color="C9C7C1" w:sz="4"/>
-              <w:bottom w:val="single" w:color="C9C7C1" w:sz="4"/>
-              <w:right w:val="single" w:color="C9C7C1" w:sz="4"/>
-            </w:tcBorders>
-            <w:shd w:fill="F7F7F5" w:color="auto" w:val="clear"/>
+                <w:sz w:val="17"/>
+                <w:szCs w:val="17"/>
+              </w:rPr>
+              <w:t xml:space="preserve">0.0</w:t>
+            </w:r>
+          </w:p>
+        </w:tc>
+        <w:tc>
+          <w:tcPr>
+            <w:tcW w:type="dxa" w:w="1700"/>
+            <w:tcBorders>
+              <w:top w:val="single" w:color="C9C7C1" w:sz="4"/>
+              <w:left w:val="single" w:color="C9C7C1" w:sz="4"/>
+              <w:bottom w:val="single" w:color="C9C7C1" w:sz="4"/>
+              <w:right w:val="single" w:color="C9C7C1" w:sz="4"/>
+            </w:tcBorders>
+            <w:shd w:fill="E3EEFB" w:color="auto" w:val="clear"/>
             <w:tcMar>
               <w:top w:type="dxa" w:w="60"/>
               <w:left w:type="dxa" w:w="100"/>
@@ -15341,23 +14721,23 @@
             <w:r>
               <w:rPr>
                 <w:color w:val="000000"/>
-                <w:sz w:val="16"/>
-                <w:szCs w:val="16"/>
-              </w:rPr>
-              <w:t xml:space="preserve">64</w:t>
-            </w:r>
-          </w:p>
-        </w:tc>
-        <w:tc>
-          <w:tcPr>
-            <w:tcW w:type="dxa" w:w="1000"/>
-            <w:tcBorders>
-              <w:top w:val="single" w:color="C9C7C1" w:sz="4"/>
-              <w:left w:val="single" w:color="C9C7C1" w:sz="4"/>
-              <w:bottom w:val="single" w:color="C9C7C1" w:sz="4"/>
-              <w:right w:val="single" w:color="C9C7C1" w:sz="4"/>
-            </w:tcBorders>
-            <w:shd w:fill="F7F7F5" w:color="auto" w:val="clear"/>
+                <w:sz w:val="17"/>
+                <w:szCs w:val="17"/>
+              </w:rPr>
+              <w:t xml:space="preserve">9.28</w:t>
+            </w:r>
+          </w:p>
+        </w:tc>
+        <w:tc>
+          <w:tcPr>
+            <w:tcW w:type="dxa" w:w="1426"/>
+            <w:tcBorders>
+              <w:top w:val="single" w:color="C9C7C1" w:sz="4"/>
+              <w:left w:val="single" w:color="C9C7C1" w:sz="4"/>
+              <w:bottom w:val="single" w:color="C9C7C1" w:sz="4"/>
+              <w:right w:val="single" w:color="C9C7C1" w:sz="4"/>
+            </w:tcBorders>
+            <w:shd w:fill="E3EEFB" w:color="auto" w:val="clear"/>
             <w:tcMar>
               <w:top w:type="dxa" w:w="60"/>
               <w:left w:type="dxa" w:w="100"/>
@@ -15373,458 +14753,10 @@
             <w:r>
               <w:rPr>
                 <w:color w:val="000000"/>
-                <w:sz w:val="16"/>
-                <w:szCs w:val="16"/>
-              </w:rPr>
-              <w:t xml:space="preserve">0</w:t>
-            </w:r>
-          </w:p>
-        </w:tc>
-        <w:tc>
-          <w:tcPr>
-            <w:tcW w:type="dxa" w:w="1926"/>
-            <w:tcBorders>
-              <w:top w:val="single" w:color="C9C7C1" w:sz="4"/>
-              <w:left w:val="single" w:color="C9C7C1" w:sz="4"/>
-              <w:bottom w:val="single" w:color="C9C7C1" w:sz="4"/>
-              <w:right w:val="single" w:color="C9C7C1" w:sz="4"/>
-            </w:tcBorders>
-            <w:shd w:fill="F7F7F5" w:color="auto" w:val="clear"/>
-            <w:tcMar>
-              <w:top w:type="dxa" w:w="60"/>
-              <w:left w:type="dxa" w:w="100"/>
-              <w:bottom w:type="dxa" w:w="60"/>
-              <w:right w:type="dxa" w:w="100"/>
-            </w:tcMar>
-          </w:tcPr>
-          <w:p>
-            <w:pPr>
-              <w:spacing w:after="0"/>
-              <w:jc w:val="center"/>
-            </w:pPr>
-            <w:r>
-              <w:rPr>
-                <w:color w:val="000000"/>
-                <w:sz w:val="16"/>
-                <w:szCs w:val="16"/>
-              </w:rPr>
-              <w:t xml:space="preserve">807</w:t>
-            </w:r>
-          </w:p>
-        </w:tc>
-      </w:tr>
-      <w:tr>
-        <w:trPr>
-          <w:tblHeader w:val="false"/>
-        </w:trPr>
-        <w:tc>
-          <w:tcPr>
-            <w:tcW w:type="dxa" w:w="2800"/>
-            <w:tcBorders>
-              <w:top w:val="single" w:color="C9C7C1" w:sz="4"/>
-              <w:left w:val="single" w:color="C9C7C1" w:sz="4"/>
-              <w:bottom w:val="single" w:color="C9C7C1" w:sz="4"/>
-              <w:right w:val="single" w:color="C9C7C1" w:sz="4"/>
-            </w:tcBorders>
-            <w:tcMar>
-              <w:top w:type="dxa" w:w="60"/>
-              <w:left w:type="dxa" w:w="100"/>
-              <w:bottom w:type="dxa" w:w="60"/>
-              <w:right w:type="dxa" w:w="100"/>
-            </w:tcMar>
-          </w:tcPr>
-          <w:p>
-            <w:pPr>
-              <w:spacing w:after="0"/>
-              <w:jc w:val="left"/>
-            </w:pPr>
-            <w:r>
-              <w:rPr>
-                <w:color w:val="000000"/>
-                <w:sz w:val="16"/>
-                <w:szCs w:val="16"/>
-              </w:rPr>
-              <w:t xml:space="preserve">heavy cross-traffic (0.5 veh/s)</w:t>
-            </w:r>
-          </w:p>
-          <w:p>
-            <w:pPr>
-              <w:spacing w:after="0"/>
-              <w:jc w:val="left"/>
-            </w:pPr>
-            <w:r>
-              <w:rPr>
-                <w:color w:val="000000"/>
-                <w:sz w:val="16"/>
-                <w:szCs w:val="16"/>
-              </w:rPr>
-              <w:t xml:space="preserve">TSP OFF</w:t>
-            </w:r>
-          </w:p>
-        </w:tc>
-        <w:tc>
-          <w:tcPr>
-            <w:tcW w:type="dxa" w:w="1150"/>
-            <w:tcBorders>
-              <w:top w:val="single" w:color="C9C7C1" w:sz="4"/>
-              <w:left w:val="single" w:color="C9C7C1" w:sz="4"/>
-              <w:bottom w:val="single" w:color="C9C7C1" w:sz="4"/>
-              <w:right w:val="single" w:color="C9C7C1" w:sz="4"/>
-            </w:tcBorders>
-            <w:tcMar>
-              <w:top w:type="dxa" w:w="60"/>
-              <w:left w:type="dxa" w:w="100"/>
-              <w:bottom w:type="dxa" w:w="60"/>
-              <w:right w:type="dxa" w:w="100"/>
-            </w:tcMar>
-          </w:tcPr>
-          <w:p>
-            <w:pPr>
-              <w:spacing w:after="0"/>
-              <w:jc w:val="center"/>
-            </w:pPr>
-            <w:r>
-              <w:rPr>
-                <w:color w:val="000000"/>
-                <w:sz w:val="16"/>
-                <w:szCs w:val="16"/>
-              </w:rPr>
-              <w:t xml:space="preserve">63.3</w:t>
-            </w:r>
-          </w:p>
-        </w:tc>
-        <w:tc>
-          <w:tcPr>
-            <w:tcW w:type="dxa" w:w="1150"/>
-            <w:tcBorders>
-              <w:top w:val="single" w:color="C9C7C1" w:sz="4"/>
-              <w:left w:val="single" w:color="C9C7C1" w:sz="4"/>
-              <w:bottom w:val="single" w:color="C9C7C1" w:sz="4"/>
-              <w:right w:val="single" w:color="C9C7C1" w:sz="4"/>
-            </w:tcBorders>
-            <w:tcMar>
-              <w:top w:type="dxa" w:w="60"/>
-              <w:left w:type="dxa" w:w="100"/>
-              <w:bottom w:type="dxa" w:w="60"/>
-              <w:right w:type="dxa" w:w="100"/>
-            </w:tcMar>
-          </w:tcPr>
-          <w:p>
-            <w:pPr>
-              <w:spacing w:after="0"/>
-              <w:jc w:val="center"/>
-            </w:pPr>
-            <w:r>
-              <w:rPr>
-                <w:color w:val="000000"/>
-                <w:sz w:val="16"/>
-                <w:szCs w:val="16"/>
-              </w:rPr>
-              <w:t xml:space="preserve">2.87</w:t>
-            </w:r>
-          </w:p>
-        </w:tc>
-        <w:tc>
-          <w:tcPr>
-            <w:tcW w:type="dxa" w:w="1000"/>
-            <w:tcBorders>
-              <w:top w:val="single" w:color="C9C7C1" w:sz="4"/>
-              <w:left w:val="single" w:color="C9C7C1" w:sz="4"/>
-              <w:bottom w:val="single" w:color="C9C7C1" w:sz="4"/>
-              <w:right w:val="single" w:color="C9C7C1" w:sz="4"/>
-            </w:tcBorders>
-            <w:tcMar>
-              <w:top w:type="dxa" w:w="60"/>
-              <w:left w:type="dxa" w:w="100"/>
-              <w:bottom w:type="dxa" w:w="60"/>
-              <w:right w:type="dxa" w:w="100"/>
-            </w:tcMar>
-          </w:tcPr>
-          <w:p>
-            <w:pPr>
-              <w:spacing w:after="0"/>
-              <w:jc w:val="center"/>
-            </w:pPr>
-            <w:r>
-              <w:rPr>
-                <w:color w:val="000000"/>
-                <w:sz w:val="16"/>
-                <w:szCs w:val="16"/>
-              </w:rPr>
-              <w:t xml:space="preserve">0</w:t>
-            </w:r>
-          </w:p>
-        </w:tc>
-        <w:tc>
-          <w:tcPr>
-            <w:tcW w:type="dxa" w:w="1000"/>
-            <w:tcBorders>
-              <w:top w:val="single" w:color="C9C7C1" w:sz="4"/>
-              <w:left w:val="single" w:color="C9C7C1" w:sz="4"/>
-              <w:bottom w:val="single" w:color="C9C7C1" w:sz="4"/>
-              <w:right w:val="single" w:color="C9C7C1" w:sz="4"/>
-            </w:tcBorders>
-            <w:tcMar>
-              <w:top w:type="dxa" w:w="60"/>
-              <w:left w:type="dxa" w:w="100"/>
-              <w:bottom w:type="dxa" w:w="60"/>
-              <w:right w:type="dxa" w:w="100"/>
-            </w:tcMar>
-          </w:tcPr>
-          <w:p>
-            <w:pPr>
-              <w:spacing w:after="0"/>
-              <w:jc w:val="center"/>
-            </w:pPr>
-            <w:r>
-              <w:rPr>
-                <w:color w:val="000000"/>
-                <w:sz w:val="16"/>
-                <w:szCs w:val="16"/>
-              </w:rPr>
-              <w:t xml:space="preserve">0</w:t>
-            </w:r>
-          </w:p>
-        </w:tc>
-        <w:tc>
-          <w:tcPr>
-            <w:tcW w:type="dxa" w:w="1926"/>
-            <w:tcBorders>
-              <w:top w:val="single" w:color="C9C7C1" w:sz="4"/>
-              <w:left w:val="single" w:color="C9C7C1" w:sz="4"/>
-              <w:bottom w:val="single" w:color="C9C7C1" w:sz="4"/>
-              <w:right w:val="single" w:color="C9C7C1" w:sz="4"/>
-            </w:tcBorders>
-            <w:tcMar>
-              <w:top w:type="dxa" w:w="60"/>
-              <w:left w:type="dxa" w:w="100"/>
-              <w:bottom w:type="dxa" w:w="60"/>
-              <w:right w:type="dxa" w:w="100"/>
-            </w:tcMar>
-          </w:tcPr>
-          <w:p>
-            <w:pPr>
-              <w:spacing w:after="0"/>
-              <w:jc w:val="center"/>
-            </w:pPr>
-            <w:r>
-              <w:rPr>
-                <w:color w:val="000000"/>
-                <w:sz w:val="16"/>
-                <w:szCs w:val="16"/>
-              </w:rPr>
-              <w:t xml:space="preserve">-</w:t>
-            </w:r>
-          </w:p>
-        </w:tc>
-      </w:tr>
-      <w:tr>
-        <w:trPr>
-          <w:tblHeader w:val="false"/>
-        </w:trPr>
-        <w:tc>
-          <w:tcPr>
-            <w:tcW w:type="dxa" w:w="2800"/>
-            <w:tcBorders>
-              <w:top w:val="single" w:color="C9C7C1" w:sz="4"/>
-              <w:left w:val="single" w:color="C9C7C1" w:sz="4"/>
-              <w:bottom w:val="single" w:color="C9C7C1" w:sz="4"/>
-              <w:right w:val="single" w:color="C9C7C1" w:sz="4"/>
-            </w:tcBorders>
-            <w:shd w:fill="F7F7F5" w:color="auto" w:val="clear"/>
-            <w:tcMar>
-              <w:top w:type="dxa" w:w="60"/>
-              <w:left w:type="dxa" w:w="100"/>
-              <w:bottom w:type="dxa" w:w="60"/>
-              <w:right w:type="dxa" w:w="100"/>
-            </w:tcMar>
-          </w:tcPr>
-          <w:p>
-            <w:pPr>
-              <w:spacing w:after="0"/>
-              <w:jc w:val="left"/>
-            </w:pPr>
-            <w:r>
-              <w:rPr>
-                <w:color w:val="000000"/>
-                <w:sz w:val="16"/>
-                <w:szCs w:val="16"/>
-              </w:rPr>
-              <w:t xml:space="preserve">heavy cross-traffic (0.5 veh/s)</w:t>
-            </w:r>
-          </w:p>
-          <w:p>
-            <w:pPr>
-              <w:spacing w:after="0"/>
-              <w:jc w:val="left"/>
-            </w:pPr>
-            <w:r>
-              <w:rPr>
-                <w:color w:val="000000"/>
-                <w:sz w:val="16"/>
-                <w:szCs w:val="16"/>
-              </w:rPr>
-              <w:t xml:space="preserve">TSP ON</w:t>
-            </w:r>
-          </w:p>
-        </w:tc>
-        <w:tc>
-          <w:tcPr>
-            <w:tcW w:type="dxa" w:w="1150"/>
-            <w:tcBorders>
-              <w:top w:val="single" w:color="C9C7C1" w:sz="4"/>
-              <w:left w:val="single" w:color="C9C7C1" w:sz="4"/>
-              <w:bottom w:val="single" w:color="C9C7C1" w:sz="4"/>
-              <w:right w:val="single" w:color="C9C7C1" w:sz="4"/>
-            </w:tcBorders>
-            <w:shd w:fill="F7F7F5" w:color="auto" w:val="clear"/>
-            <w:tcMar>
-              <w:top w:type="dxa" w:w="60"/>
-              <w:left w:type="dxa" w:w="100"/>
-              <w:bottom w:type="dxa" w:w="60"/>
-              <w:right w:type="dxa" w:w="100"/>
-            </w:tcMar>
-          </w:tcPr>
-          <w:p>
-            <w:pPr>
-              <w:spacing w:after="0"/>
-              <w:jc w:val="center"/>
-            </w:pPr>
-            <w:r>
-              <w:rPr>
-                <w:color w:val="000000"/>
-                <w:sz w:val="16"/>
-                <w:szCs w:val="16"/>
-              </w:rPr>
-              <w:t xml:space="preserve">59.5</w:t>
-            </w:r>
-          </w:p>
-        </w:tc>
-        <w:tc>
-          <w:tcPr>
-            <w:tcW w:type="dxa" w:w="1150"/>
-            <w:tcBorders>
-              <w:top w:val="single" w:color="C9C7C1" w:sz="4"/>
-              <w:left w:val="single" w:color="C9C7C1" w:sz="4"/>
-              <w:bottom w:val="single" w:color="C9C7C1" w:sz="4"/>
-              <w:right w:val="single" w:color="C9C7C1" w:sz="4"/>
-            </w:tcBorders>
-            <w:shd w:fill="F7F7F5" w:color="auto" w:val="clear"/>
-            <w:tcMar>
-              <w:top w:type="dxa" w:w="60"/>
-              <w:left w:type="dxa" w:w="100"/>
-              <w:bottom w:type="dxa" w:w="60"/>
-              <w:right w:type="dxa" w:w="100"/>
-            </w:tcMar>
-          </w:tcPr>
-          <w:p>
-            <w:pPr>
-              <w:spacing w:after="0"/>
-              <w:jc w:val="center"/>
-            </w:pPr>
-            <w:r>
-              <w:rPr>
-                <w:color w:val="000000"/>
-                <w:sz w:val="16"/>
-                <w:szCs w:val="16"/>
-              </w:rPr>
-              <w:t xml:space="preserve">4.12</w:t>
-            </w:r>
-          </w:p>
-        </w:tc>
-        <w:tc>
-          <w:tcPr>
-            <w:tcW w:type="dxa" w:w="1000"/>
-            <w:tcBorders>
-              <w:top w:val="single" w:color="C9C7C1" w:sz="4"/>
-              <w:left w:val="single" w:color="C9C7C1" w:sz="4"/>
-              <w:bottom w:val="single" w:color="C9C7C1" w:sz="4"/>
-              <w:right w:val="single" w:color="C9C7C1" w:sz="4"/>
-            </w:tcBorders>
-            <w:shd w:fill="F7F7F5" w:color="auto" w:val="clear"/>
-            <w:tcMar>
-              <w:top w:type="dxa" w:w="60"/>
-              <w:left w:type="dxa" w:w="100"/>
-              <w:bottom w:type="dxa" w:w="60"/>
-              <w:right w:type="dxa" w:w="100"/>
-            </w:tcMar>
-          </w:tcPr>
-          <w:p>
-            <w:pPr>
-              <w:spacing w:after="0"/>
-              <w:jc w:val="center"/>
-            </w:pPr>
-            <w:r>
-              <w:rPr>
-                <w:color w:val="000000"/>
-                <w:sz w:val="16"/>
-                <w:szCs w:val="16"/>
-              </w:rPr>
-              <w:t xml:space="preserve">43</w:t>
-            </w:r>
-          </w:p>
-        </w:tc>
-        <w:tc>
-          <w:tcPr>
-            <w:tcW w:type="dxa" w:w="1000"/>
-            <w:tcBorders>
-              <w:top w:val="single" w:color="C9C7C1" w:sz="4"/>
-              <w:left w:val="single" w:color="C9C7C1" w:sz="4"/>
-              <w:bottom w:val="single" w:color="C9C7C1" w:sz="4"/>
-              <w:right w:val="single" w:color="C9C7C1" w:sz="4"/>
-            </w:tcBorders>
-            <w:shd w:fill="F7F7F5" w:color="auto" w:val="clear"/>
-            <w:tcMar>
-              <w:top w:type="dxa" w:w="60"/>
-              <w:left w:type="dxa" w:w="100"/>
-              <w:bottom w:type="dxa" w:w="60"/>
-              <w:right w:type="dxa" w:w="100"/>
-            </w:tcMar>
-          </w:tcPr>
-          <w:p>
-            <w:pPr>
-              <w:spacing w:after="0"/>
-              <w:jc w:val="center"/>
-            </w:pPr>
-            <w:r>
-              <w:rPr>
-                <w:color w:val="000000"/>
-                <w:sz w:val="16"/>
-                <w:szCs w:val="16"/>
-              </w:rPr>
-              <w:t xml:space="preserve">21</w:t>
-            </w:r>
-          </w:p>
-        </w:tc>
-        <w:tc>
-          <w:tcPr>
-            <w:tcW w:type="dxa" w:w="1926"/>
-            <w:tcBorders>
-              <w:top w:val="single" w:color="C9C7C1" w:sz="4"/>
-              <w:left w:val="single" w:color="C9C7C1" w:sz="4"/>
-              <w:bottom w:val="single" w:color="C9C7C1" w:sz="4"/>
-              <w:right w:val="single" w:color="C9C7C1" w:sz="4"/>
-            </w:tcBorders>
-            <w:shd w:fill="F7F7F5" w:color="auto" w:val="clear"/>
-            <w:tcMar>
-              <w:top w:type="dxa" w:w="60"/>
-              <w:left w:type="dxa" w:w="100"/>
-              <w:bottom w:type="dxa" w:w="60"/>
-              <w:right w:type="dxa" w:w="100"/>
-            </w:tcMar>
-          </w:tcPr>
-          <w:p>
-            <w:pPr>
-              <w:spacing w:after="0"/>
-              <w:jc w:val="center"/>
-            </w:pPr>
-            <w:r>
-              <w:rPr>
-                <w:color w:val="000000"/>
-                <w:sz w:val="16"/>
-                <w:szCs w:val="16"/>
-              </w:rPr>
-              <w:t xml:space="preserve">453</w:t>
+                <w:sz w:val="17"/>
+                <w:szCs w:val="17"/>
+              </w:rPr>
+              <w:t xml:space="preserve">100.0</w:t>
             </w:r>
           </w:p>
         </w:tc>
@@ -15845,7 +14777,7 @@
           <wp:inline distT="0" distB="0" distL="0" distR="0">
             <wp:extent cx="5334000" cy="2390775"/>
             <wp:effectExtent t="0" r="0" b="0" l="0"/>
-            <wp:docPr id="1" name="fig" descr="Figure 10. Negotiation in action: under heavy cross traffic a third of the proposals are rejected" title="Figure 10. Negotiation in action: under heavy cross traffic a third of the proposals are rejected"/>
+            <wp:docPr id="1" name="fig" descr="Figure 10. Conventional city vs our system" title="Figure 10. Conventional city vs our system"/>
             <wp:cNvGraphicFramePr>
               <a:graphicFrameLocks xmlns:a="http://schemas.openxmlformats.org/drawingml/2006/main" noChangeAspect="1"/>
             </wp:cNvGraphicFramePr>
@@ -15894,15 +14826,15 @@
           <w:sz w:val="18"/>
           <w:szCs w:val="18"/>
         </w:rPr>
-        <w:t xml:space="preserve">Figure 10. Negotiation in action: under heavy cross traffic a third of the proposals are rejected</w:t>
+        <w:t xml:space="preserve">Figure 10. Conventional city vs our system</w:t>
       </w:r>
     </w:p>
     <w:p>
       <w:pPr>
         <w:pBdr>
-          <w:left w:val="single" w:color="EB6834" w:sz="24" w:space="8"/>
+          <w:left w:val="single" w:color="1BAF7A" w:sz="24" w:space="8"/>
         </w:pBdr>
-        <w:shd w:fill="FFF4E5" w:color="auto" w:val="clear"/>
+        <w:shd w:fill="E8F6EE" w:color="auto" w:val="clear"/>
         <w:spacing w:after="160" w:before="80" w:line="276"/>
         <w:ind w:left="160" w:right="160"/>
       </w:pPr>
@@ -15911,10 +14843,40 @@
           <w:b/>
           <w:bCs/>
         </w:rPr>
-        <w:t xml:space="preserve">Honest trade-off.</w:t>
-      </w:r>
-      <w:r>
-        <w:t xml:space="preserve"> Bus priority makes each bus about 5.8 s faster, but car waiting on the cross street roughly doubles (2.41 s to 4.76 s). It is still worth it in person-seconds: a bus carries 40 people, a car about 1.2. Under heavy cross traffic the intersection rejects 21 proposals, which caps the harm.</w:t>
+        <w:t xml:space="preserve">Result.</w:t>
+      </w:r>
+      <w:r>
+        <w:t xml:space="preserve"> The ambulance is </w:t>
+      </w:r>
+      <w:r>
+        <w:rPr>
+          <w:b/>
+          <w:bCs/>
+        </w:rPr>
+        <w:t xml:space="preserve">42.1% faster</w:t>
+      </w:r>
+      <w:r>
+        <w:t xml:space="preserve"> and never waits at a red light; the average car waits </w:t>
+      </w:r>
+      <w:r>
+        <w:rPr>
+          <w:b/>
+          <w:bCs/>
+        </w:rPr>
+        <w:t xml:space="preserve">56.3% less</w:t>
+      </w:r>
+      <w:r>
+        <w:t xml:space="preserve">. </w:t>
+      </w:r>
+      <w:r>
+        <w:rPr>
+          <w:b/>
+          <w:bCs/>
+        </w:rPr>
+        <w:t xml:space="preserve">Honest note:</w:t>
+      </w:r>
+      <w:r>
+        <w:t xml:space="preserve"> the ambulance trip is the same in every seed because it depends on the signal timings, not the random cars. Individual cars can be slower in our system (for example Car 1 in the demo), the gain is in the average.</w:t>
       </w:r>
     </w:p>
     <w:p>
@@ -16360,7 +15322,7 @@
         <w:spacing w:after="120" w:line="276"/>
       </w:pPr>
       <w:r>
-        <w:t xml:space="preserve">Tuned parameters: min green 3 s, max green 15 s, beta 1.5, theta 3. Defaults were 5 s, 30 s, 0.5 and 1.0. The search used 62 simulated evaluations (12.2 s). The improvement carries over to validation seeds that were never used in the search, so it is not over-fitting. Note that the 3 s minimum green sits at the edge of the grid. A real deployment would enforce a pedestrian-safe minimum instead.</w:t>
+        <w:t xml:space="preserve">Tuned parameters: min green 3 s, max green 15 s, beta 1.5, theta 3. Defaults were 5 s, 30 s, 0.5 and 1.0. The search used 62 simulated evaluations (12.7 s). The improvement carries over to validation seeds that were never used in the search, so it is not over-fitting. Note that the 3 s minimum green sits at the edge of the grid. A real deployment would enforce a pedestrian-safe minimum instead.</w:t>
       </w:r>
     </w:p>
     <w:p>
@@ -16918,7 +15880,7 @@
                 <w:sz w:val="17"/>
                 <w:szCs w:val="17"/>
               </w:rPr>
-              <w:t xml:space="preserve">0.19</w:t>
+              <w:t xml:space="preserve">0.12</w:t>
             </w:r>
           </w:p>
         </w:tc>
@@ -17179,7 +16141,7 @@
                 <w:sz w:val="17"/>
                 <w:szCs w:val="17"/>
               </w:rPr>
-              <w:t xml:space="preserve">0.23</w:t>
+              <w:t xml:space="preserve">0.21</w:t>
             </w:r>
           </w:p>
         </w:tc>
@@ -17432,7 +16394,7 @@
                 <w:sz w:val="17"/>
                 <w:szCs w:val="17"/>
               </w:rPr>
-              <w:t xml:space="preserve">0.36</w:t>
+              <w:t xml:space="preserve">0.40</w:t>
             </w:r>
           </w:p>
         </w:tc>
@@ -17693,7 +16655,7 @@
                 <w:sz w:val="17"/>
                 <w:szCs w:val="17"/>
               </w:rPr>
-              <w:t xml:space="preserve">0.52</w:t>
+              <w:t xml:space="preserve">0.62</w:t>
             </w:r>
           </w:p>
         </w:tc>
@@ -17946,7 +16908,7 @@
                 <w:sz w:val="17"/>
                 <w:szCs w:val="17"/>
               </w:rPr>
-              <w:t xml:space="preserve">0.71</w:t>
+              <w:t xml:space="preserve">0.79</w:t>
             </w:r>
           </w:p>
         </w:tc>
@@ -18207,7 +17169,7 @@
                 <w:sz w:val="17"/>
                 <w:szCs w:val="17"/>
               </w:rPr>
-              <w:t xml:space="preserve">1.44</w:t>
+              <w:t xml:space="preserve">1.35</w:t>
             </w:r>
           </w:p>
         </w:tc>
@@ -18293,7 +17255,7 @@
         <w:spacing w:after="120" w:line="276"/>
       </w:pPr>
       <w:r>
-        <w:t xml:space="preserve">43 of 43 automated tests pass (18 s): 23 unit tests, 9 integration tests (agent interaction and safety invariants) and 9 system acceptance tests, one per scenario. The full test cases, expected and actual values, and the defects found during testing are in the separate </w:t>
+        <w:t xml:space="preserve">43 of 43 automated tests pass (17.6 s): 23 unit tests, 9 integration tests (agent interaction and safety invariants) and 9 system acceptance tests, one per scenario. The full test cases, expected and actual values, and the defects found during testing are in the separate </w:t>
       </w:r>
       <w:r>
         <w:rPr>
@@ -18383,7 +17345,7 @@
           <w:sz w:val="14"/>
           <w:szCs w:val="14"/>
         </w:rPr>
-        <w:t xml:space="preserve">  agents/intersection_agent.py  Max-Pressure, preemption, TSP, green-wave        M2</w:t>
+        <w:t xml:space="preserve">  agents/intersection_agent.py  Max-Pressure, preemption, green-wave        M2</w:t>
       </w:r>
     </w:p>
     <w:p>
@@ -18418,23 +17380,6 @@
           <w:szCs w:val="14"/>
         </w:rPr>
         <w:t xml:space="preserve">  agents/emergency_agent.py   look-ahead preemption                              M4</w:t>
-      </w:r>
-    </w:p>
-    <w:p>
-      <w:pPr>
-        <w:keepNext/>
-        <w:keepLines/>
-        <w:shd w:fill="F4F3F0" w:color="auto" w:val="clear"/>
-        <w:spacing w:after="0" w:line="240"/>
-        <w:ind w:left="120" w:right="120"/>
-      </w:pPr>
-      <w:r>
-        <w:rPr>
-          <w:rFonts w:ascii="Consolas" w:cs="Consolas" w:eastAsia="Consolas" w:hAnsi="Consolas"/>
-          <w:sz w:val="14"/>
-          <w:szCs w:val="14"/>
-        </w:rPr>
-        <w:t xml:space="preserve">  agents/bus_agent.py         negotiated priority                                M4</w:t>
       </w:r>
     </w:p>
     <w:p>
@@ -19220,7 +18165,7 @@
         <w:spacing w:after="60"/>
       </w:pPr>
       <w:r>
-        <w:t xml:space="preserve">The green-wave hand-off helps only on corridors, and bus priority increases cross-street car delay (Section 7).</w:t>
+        <w:t xml:space="preserve">The green-wave hand-off helps only on corridors, and it assumes the ambulance can always ask junctions for priority (Section 7).</w:t>
       </w:r>
     </w:p>
     <w:p>
@@ -19365,7 +18310,7 @@
         <w:spacing w:after="120" w:line="276"/>
       </w:pPr>
       <w:r>
-        <w:t xml:space="preserve">A decentralised multi-agent design meets every objective. Local Max-Pressure control with an anti-starvation term cuts waiting by 47.5% and never leaves a car unserved. A* over each vehicle's own beliefs gives optimal routes at a fraction of UCS's search effort. Explicit protocols let an ambulance cross without stopping, let a bus negotiate rather than override, and let one broadcast about an incident save vehicles about a third of their travel time. The coordinator improves every controller by hill climbing without taking control away from them. Because every claim is tied to a regenerable result and an automated test, the system can be checked rather than taken on trust.</w:t>
+        <w:t xml:space="preserve">A decentralised multi-agent design meets every objective. Local Max-Pressure control with an anti-starvation term cuts waiting by 47.5% and never leaves a car unserved. A* over each vehicle's own beliefs gives optimal routes at a fraction of UCS's search effort. Explicit protocols let an ambulance cross without stopping, show a conventional city next to ours (S5), and let one broadcast about an incident save vehicles about a third of their travel time. The coordinator improves every controller by hill climbing without taking control away from them. Because every claim is tied to a regenerable result and an automated test, the system can be checked rather than taken on trust.</w:t>
       </w:r>
     </w:p>
     <w:p>
@@ -20058,7 +19003,7 @@
                 <w:sz w:val="17"/>
                 <w:szCs w:val="17"/>
               </w:rPr>
-              <w:t xml:space="preserve">No. Every switch, including an emergency one, goes through a 3 s yellow. IT-02 checks over 400 s with ambulances and buses that no green ever changes directly to the other green.</w:t>
+              <w:t xml:space="preserve">No. Every switch, including an emergency one, goes through a 3 s yellow. IT-02 checks over 400 s with ambulances that no green ever changes directly to the other green.</w:t>
             </w:r>
           </w:p>
         </w:tc>
@@ -20709,7 +19654,7 @@
                 <w:sz w:val="17"/>
                 <w:szCs w:val="17"/>
               </w:rPr>
-              <w:t xml:space="preserve">Why can a bus be refused?</w:t>
+              <w:t xml:space="preserve">Does preemption hurt other traffic?</w:t>
             </w:r>
           </w:p>
         </w:tc>
@@ -20723,73 +19668,6 @@
               <w:right w:val="single" w:color="C9C7C1" w:sz="4"/>
             </w:tcBorders>
             <w:shd w:fill="F7F7F5" w:color="auto" w:val="clear"/>
-            <w:tcMar>
-              <w:top w:type="dxa" w:w="60"/>
-              <w:left w:type="dxa" w:w="100"/>
-              <w:bottom w:type="dxa" w:w="60"/>
-              <w:right w:type="dxa" w:w="100"/>
-            </w:tcMar>
-          </w:tcPr>
-          <w:p>
-            <w:pPr>
-              <w:spacing w:after="0"/>
-              <w:jc w:val="left"/>
-            </w:pPr>
-            <w:r>
-              <w:rPr>
-                <w:color w:val="000000"/>
-                <w:sz w:val="17"/>
-                <w:szCs w:val="17"/>
-              </w:rPr>
-              <w:t xml:space="preserve">Priority for 40 passengers should not create a long queue of cars. The intersection refuses when the cross queue is over 6 or an ambulance is active (IT-03, IT-04).</w:t>
-            </w:r>
-          </w:p>
-        </w:tc>
-      </w:tr>
-      <w:tr>
-        <w:trPr>
-          <w:tblHeader w:val="false"/>
-        </w:trPr>
-        <w:tc>
-          <w:tcPr>
-            <w:tcW w:type="dxa" w:w="3000"/>
-            <w:tcBorders>
-              <w:top w:val="single" w:color="C9C7C1" w:sz="4"/>
-              <w:left w:val="single" w:color="C9C7C1" w:sz="4"/>
-              <w:bottom w:val="single" w:color="C9C7C1" w:sz="4"/>
-              <w:right w:val="single" w:color="C9C7C1" w:sz="4"/>
-            </w:tcBorders>
-            <w:tcMar>
-              <w:top w:type="dxa" w:w="60"/>
-              <w:left w:type="dxa" w:w="100"/>
-              <w:bottom w:type="dxa" w:w="60"/>
-              <w:right w:type="dxa" w:w="100"/>
-            </w:tcMar>
-          </w:tcPr>
-          <w:p>
-            <w:pPr>
-              <w:spacing w:after="0"/>
-              <w:jc w:val="left"/>
-            </w:pPr>
-            <w:r>
-              <w:rPr>
-                <w:color w:val="000000"/>
-                <w:sz w:val="17"/>
-                <w:szCs w:val="17"/>
-              </w:rPr>
-              <w:t xml:space="preserve">Does preemption hurt other traffic?</w:t>
-            </w:r>
-          </w:p>
-        </w:tc>
-        <w:tc>
-          <w:tcPr>
-            <w:tcW w:type="dxa" w:w="6026"/>
-            <w:tcBorders>
-              <w:top w:val="single" w:color="C9C7C1" w:sz="4"/>
-              <w:left w:val="single" w:color="C9C7C1" w:sz="4"/>
-              <w:bottom w:val="single" w:color="C9C7C1" w:sz="4"/>
-              <w:right w:val="single" w:color="C9C7C1" w:sz="4"/>
-            </w:tcBorders>
             <w:tcMar>
               <w:top w:type="dxa" w:w="60"/>
               <w:left w:type="dxa" w:w="100"/>

</xml_diff>

<commit_message>
Dense traffic, Send Car/Ambulance, + signals
</commit_message>
<xml_diff>
--- a/deliverables/STMS_Case_Study_Report.docx
+++ b/deliverables/STMS_Case_Study_Report.docx
@@ -853,7 +853,7 @@
         <w:t xml:space="preserve">20%</w:t>
       </w:r>
       <w:r>
-        <w:t xml:space="preserve">. The system scales to an 8x8 grid with 461 agents. All 43 automated tests pass. Negative results are reported alongside the positive ones.</w:t>
+        <w:t xml:space="preserve">. The system scales to an 8x8 grid with 461 agents. All 45 automated tests pass. Negative results are reported alongside the positive ones.</w:t>
       </w:r>
     </w:p>
     <w:p>
@@ -11119,9 +11119,9 @@
       <w:r>
         <w:drawing>
           <wp:inline distT="0" distB="0" distL="0" distR="0">
-            <wp:extent cx="5143500" cy="4143375"/>
+            <wp:extent cx="5143500" cy="4019550"/>
             <wp:effectExtent t="0" r="0" b="0" l="0"/>
-            <wp:docPr id="1" name="fig" descr="Figure 5a. Demo before the accident: both cities, same cars, same traffic" title="Figure 5a. Demo before the accident: both cities, same cars, same traffic"/>
+            <wp:docPr id="1" name="fig" descr="Figure 5a. Demo at t = 30 s: both cities, same random traffic, Car 1 on its A* route, queues and &quot;+&quot; signals visible" title="Figure 5a. Demo at t = 30 s: both cities, same random traffic, Car 1 on its A* route, queues and &quot;+&quot; signals visible"/>
             <wp:cNvGraphicFramePr>
               <a:graphicFrameLocks xmlns:a="http://schemas.openxmlformats.org/drawingml/2006/main" noChangeAspect="1"/>
             </wp:cNvGraphicFramePr>
@@ -11144,7 +11144,7 @@
                   <pic:spPr bwMode="auto">
                     <a:xfrm>
                       <a:off x="0" y="0"/>
-                      <a:ext cx="5143500" cy="4143375"/>
+                      <a:ext cx="5143500" cy="4019550"/>
                     </a:xfrm>
                     <a:prstGeom prst="rect">
                       <a:avLst/>
@@ -11170,7 +11170,7 @@
           <w:sz w:val="18"/>
           <w:szCs w:val="18"/>
         </w:rPr>
-        <w:t xml:space="preserve">Figure 5a. Demo before the accident: both cities, same cars, same traffic</w:t>
+        <w:t xml:space="preserve">Figure 5a. Demo at t = 30 s: both cities, same random traffic, Car 1 on its A* route, queues and "+" signals visible</w:t>
       </w:r>
     </w:p>
     <w:p>
@@ -11181,9 +11181,9 @@
       <w:r>
         <w:drawing>
           <wp:inline distT="0" distB="0" distL="0" distR="0">
-            <wp:extent cx="5143500" cy="4143375"/>
+            <wp:extent cx="5143500" cy="4019550"/>
             <wp:effectExtent t="0" r="0" b="0" l="0"/>
-            <wp:docPr id="1" name="fig" descr="Figure 5b. After the accident: the ambulance is already ahead in our city; Car 1 has re-routed around the closed road" title="Figure 5b. After the accident: the ambulance is already ahead in our city; Car 1 has re-routed around the closed road"/>
+            <wp:docPr id="1" name="fig" descr="Figure 5b. At t = 75 s: the ambulance is ahead in our city and has not stopped at a red light; fewer cars are queued" title="Figure 5b. At t = 75 s: the ambulance is ahead in our city and has not stopped at a red light; fewer cars are queued"/>
             <wp:cNvGraphicFramePr>
               <a:graphicFrameLocks xmlns:a="http://schemas.openxmlformats.org/drawingml/2006/main" noChangeAspect="1"/>
             </wp:cNvGraphicFramePr>
@@ -11206,7 +11206,7 @@
                   <pic:spPr bwMode="auto">
                     <a:xfrm>
                       <a:off x="0" y="0"/>
-                      <a:ext cx="5143500" cy="4143375"/>
+                      <a:ext cx="5143500" cy="4019550"/>
                     </a:xfrm>
                     <a:prstGeom prst="rect">
                       <a:avLst/>
@@ -11232,7 +11232,7 @@
           <w:sz w:val="18"/>
           <w:szCs w:val="18"/>
         </w:rPr>
-        <w:t xml:space="preserve">Figure 5b. After the accident: the ambulance is already ahead in our city; Car 1 has re-routed around the closed road</w:t>
+        <w:t xml:space="preserve">Figure 5b. At t = 75 s: the ambulance is ahead in our city and has not stopped at a red light; fewer cars are queued</w:t>
       </w:r>
     </w:p>
     <w:p>
@@ -14498,7 +14498,7 @@
                 <w:sz w:val="17"/>
                 <w:szCs w:val="17"/>
               </w:rPr>
-              <w:t xml:space="preserve">126.0</w:t>
+              <w:t xml:space="preserve">91.0</w:t>
             </w:r>
           </w:p>
         </w:tc>
@@ -14529,7 +14529,7 @@
                 <w:sz w:val="17"/>
                 <w:szCs w:val="17"/>
               </w:rPr>
-              <w:t xml:space="preserve">47.0</w:t>
+              <w:t xml:space="preserve">16.0</w:t>
             </w:r>
           </w:p>
         </w:tc>
@@ -14560,7 +14560,7 @@
                 <w:sz w:val="17"/>
                 <w:szCs w:val="17"/>
               </w:rPr>
-              <w:t xml:space="preserve">21.25</w:t>
+              <w:t xml:space="preserve">24.79</w:t>
             </w:r>
           </w:p>
         </w:tc>
@@ -14591,7 +14591,7 @@
                 <w:sz w:val="17"/>
                 <w:szCs w:val="17"/>
               </w:rPr>
-              <w:t xml:space="preserve">99.1</w:t>
+              <w:t xml:space="preserve">87.3</w:t>
             </w:r>
           </w:p>
         </w:tc>
@@ -14724,7 +14724,7 @@
                 <w:sz w:val="17"/>
                 <w:szCs w:val="17"/>
               </w:rPr>
-              <w:t xml:space="preserve">9.28</w:t>
+              <w:t xml:space="preserve">17.62</w:t>
             </w:r>
           </w:p>
         </w:tc>
@@ -14756,7 +14756,7 @@
                 <w:sz w:val="17"/>
                 <w:szCs w:val="17"/>
               </w:rPr>
-              <w:t xml:space="preserve">100.0</w:t>
+              <w:t xml:space="preserve">93.5</w:t>
             </w:r>
           </w:p>
         </w:tc>
@@ -14853,7 +14853,7 @@
           <w:b/>
           <w:bCs/>
         </w:rPr>
-        <w:t xml:space="preserve">42.1% faster</w:t>
+        <w:t xml:space="preserve">19.8% faster</w:t>
       </w:r>
       <w:r>
         <w:t xml:space="preserve"> and never waits at a red light; the average car waits </w:t>
@@ -14863,7 +14863,7 @@
           <w:b/>
           <w:bCs/>
         </w:rPr>
-        <w:t xml:space="preserve">56.3% less</w:t>
+        <w:t xml:space="preserve">28.9% less</w:t>
       </w:r>
       <w:r>
         <w:t xml:space="preserve">. </w:t>
@@ -14876,7 +14876,7 @@
         <w:t xml:space="preserve">Honest note:</w:t>
       </w:r>
       <w:r>
-        <w:t xml:space="preserve"> the ambulance trip is the same in every seed because it depends on the signal timings, not the random cars. Individual cars can be slower in our system (for example Car 1 in the demo), the gain is in the average.</w:t>
+        <w:t xml:space="preserve"> the ambulance trip is the same in every seed because it depends on the signal timings, not the random cars. Individual cars can occasionally be slower in our system; the gain is in the average.</w:t>
       </w:r>
     </w:p>
     <w:p>
@@ -15322,7 +15322,7 @@
         <w:spacing w:after="120" w:line="276"/>
       </w:pPr>
       <w:r>
-        <w:t xml:space="preserve">Tuned parameters: min green 3 s, max green 15 s, beta 1.5, theta 3. Defaults were 5 s, 30 s, 0.5 and 1.0. The search used 62 simulated evaluations (11.8 s). The improvement carries over to validation seeds that were never used in the search, so it is not over-fitting. Note that the 3 s minimum green sits at the edge of the grid. A real deployment would enforce a pedestrian-safe minimum instead.</w:t>
+        <w:t xml:space="preserve">Tuned parameters: min green 3 s, max green 15 s, beta 1.5, theta 3. Defaults were 5 s, 30 s, 0.5 and 1.0. The search used 62 simulated evaluations (16.5 s). The improvement carries over to validation seeds that were never used in the search, so it is not over-fitting. Note that the 3 s minimum green sits at the edge of the grid. A real deployment would enforce a pedestrian-safe minimum instead.</w:t>
       </w:r>
     </w:p>
     <w:p>
@@ -15880,7 +15880,7 @@
                 <w:sz w:val="17"/>
                 <w:szCs w:val="17"/>
               </w:rPr>
-              <w:t xml:space="preserve">0.12</w:t>
+              <w:t xml:space="preserve">0.18</w:t>
             </w:r>
           </w:p>
         </w:tc>
@@ -16141,7 +16141,7 @@
                 <w:sz w:val="17"/>
                 <w:szCs w:val="17"/>
               </w:rPr>
-              <w:t xml:space="preserve">0.25</w:t>
+              <w:t xml:space="preserve">0.53</w:t>
             </w:r>
           </w:p>
         </w:tc>
@@ -16394,7 +16394,7 @@
                 <w:sz w:val="17"/>
                 <w:szCs w:val="17"/>
               </w:rPr>
-              <w:t xml:space="preserve">0.37</w:t>
+              <w:t xml:space="preserve">0.59</w:t>
             </w:r>
           </w:p>
         </w:tc>
@@ -16655,7 +16655,7 @@
                 <w:sz w:val="17"/>
                 <w:szCs w:val="17"/>
               </w:rPr>
-              <w:t xml:space="preserve">0.59</w:t>
+              <w:t xml:space="preserve">1.18</w:t>
             </w:r>
           </w:p>
         </w:tc>
@@ -16908,7 +16908,7 @@
                 <w:sz w:val="17"/>
                 <w:szCs w:val="17"/>
               </w:rPr>
-              <w:t xml:space="preserve">0.78</w:t>
+              <w:t xml:space="preserve">1.18</w:t>
             </w:r>
           </w:p>
         </w:tc>
@@ -17169,7 +17169,7 @@
                 <w:sz w:val="17"/>
                 <w:szCs w:val="17"/>
               </w:rPr>
-              <w:t xml:space="preserve">1.59</w:t>
+              <w:t xml:space="preserve">2.39</w:t>
             </w:r>
           </w:p>
         </w:tc>
@@ -17255,7 +17255,7 @@
         <w:spacing w:after="120" w:line="276"/>
       </w:pPr>
       <w:r>
-        <w:t xml:space="preserve">43 of 43 automated tests pass (19.2 s): 23 unit tests, 9 integration tests (agent interaction and safety invariants) and 9 system acceptance tests, one per scenario. The full test cases, expected and actual values, and the defects found during testing are in the separate </w:t>
+        <w:t xml:space="preserve">45 of 45 automated tests pass (26.8 s): 23 unit tests, 9 integration tests (agent interaction and safety invariants) and 9 system acceptance tests, one per scenario. The full test cases, expected and actual values, and the defects found during testing are in the separate </w:t>
       </w:r>
       <w:r>
         <w:rPr>

</xml_diff>